<commit_message>
Stand nach dem ersten Zusammensitzen
</commit_message>
<xml_diff>
--- a/Doku/ Doku Program.docx
+++ b/Doku/ Doku Program.docx
@@ -331,7 +331,10 @@
               <w:tab/>
             </w:r>
             <w:r>
-              <w:t>9482671</w:t>
+              <w:t xml:space="preserve">7006161 / 2480084 / </w:t>
+            </w:r>
+            <w:r>
+              <w:t xml:space="preserve">9482671 </w:t>
             </w:r>
           </w:p>
           <w:p>
@@ -512,7 +515,7 @@
           <w:sz w:val="24"/>
           <w:szCs w:val="18"/>
         </w:rPr>
-        <w:t>s Spiels in Visual Basic mit dem Titel (</w:t>
+        <w:t xml:space="preserve">s Spiels in Visual Basic mit dem Titel </w:t>
       </w:r>
       <w:r>
         <w:rPr>
@@ -520,9 +523,8 @@
           <w:bCs/>
           <w:sz w:val="24"/>
           <w:szCs w:val="18"/>
-          <w:highlight w:val="yellow"/>
         </w:rPr>
-        <w:t>…</w:t>
+        <w:t>(Geisterfahrer mit Demenz</w:t>
       </w:r>
       <w:r>
         <w:rPr>
@@ -773,8 +775,11 @@
         <w:spacing w:after="160" w:line="360" w:lineRule="auto"/>
         <w:jc w:val="both"/>
         <w:rPr>
-          <w:sz w:val="24"/>
-          <w:szCs w:val="24"/>
+          <w:rFonts w:cs="Arial"/>
+          <w:b/>
+          <w:bCs/>
+          <w:sz w:val="28"/>
+          <w:szCs w:val="28"/>
         </w:rPr>
       </w:pPr>
       <w:bookmarkStart w:id="3" w:name="_Toc140144482"/>
@@ -801,6 +806,47 @@
           <w:szCs w:val="28"/>
         </w:rPr>
         <w:t xml:space="preserve"> des Projekts</w:t>
+      </w:r>
+    </w:p>
+    <w:p>
+      <w:pPr>
+        <w:pStyle w:val="Listenabsatz"/>
+        <w:numPr>
+          <w:ilvl w:val="0"/>
+          <w:numId w:val="25"/>
+        </w:numPr>
+      </w:pPr>
+      <w:r>
+        <w:t xml:space="preserve">Wir haben mit </w:t>
+      </w:r>
+      <w:proofErr w:type="spellStart"/>
+      <w:r>
+        <w:t>Github</w:t>
+      </w:r>
+      <w:proofErr w:type="spellEnd"/>
+      <w:r>
+        <w:t xml:space="preserve"> in einem 3-er </w:t>
+      </w:r>
+      <w:r>
+        <w:t>T</w:t>
+      </w:r>
+      <w:r>
+        <w:t>eam gearbeitet</w:t>
+      </w:r>
+    </w:p>
+    <w:p>
+      <w:pPr>
+        <w:pStyle w:val="Listenabsatz"/>
+        <w:numPr>
+          <w:ilvl w:val="0"/>
+          <w:numId w:val="25"/>
+        </w:numPr>
+      </w:pPr>
+      <w:r>
+        <w:t xml:space="preserve">Wir haben KI zur </w:t>
+      </w:r>
+      <w:r>
+        <w:t>Recherchezwecken und zur Hilfestellung benutzt</w:t>
       </w:r>
     </w:p>
     <w:p>
@@ -1797,7 +1843,453 @@
     <w:p>
       <w:pPr>
         <w:pStyle w:val="Listenabsatz"/>
-      </w:pPr>
+        <w:numPr>
+          <w:ilvl w:val="0"/>
+          <w:numId w:val="22"/>
+        </w:numPr>
+      </w:pPr>
+      <w:r>
+        <w:t>Auto könnte aus mehreren Pixeln bestehen</w:t>
+      </w:r>
+    </w:p>
+    <w:p>
+      <w:pPr>
+        <w:pStyle w:val="Listenabsatz"/>
+        <w:numPr>
+          <w:ilvl w:val="0"/>
+          <w:numId w:val="22"/>
+        </w:numPr>
+      </w:pPr>
+      <w:r>
+        <w:t>Spielfeld wird in Spuren aufgeteilt</w:t>
+      </w:r>
+    </w:p>
+    <w:p>
+      <w:pPr>
+        <w:pStyle w:val="Listenabsatz"/>
+        <w:numPr>
+          <w:ilvl w:val="0"/>
+          <w:numId w:val="23"/>
+        </w:numPr>
+      </w:pPr>
+      <w:r>
+        <w:t>Visuelle Abgrenzung der Spuren durch striche</w:t>
+      </w:r>
+    </w:p>
+    <w:p>
+      <w:pPr>
+        <w:pStyle w:val="Listenabsatz"/>
+        <w:numPr>
+          <w:ilvl w:val="0"/>
+          <w:numId w:val="23"/>
+        </w:numPr>
+      </w:pPr>
+    </w:p>
+    <w:p>
+      <w:pPr>
+        <w:pStyle w:val="Listenabsatz"/>
+        <w:numPr>
+          <w:ilvl w:val="0"/>
+          <w:numId w:val="22"/>
+        </w:numPr>
+      </w:pPr>
+      <w:r>
+        <w:t xml:space="preserve">Das Auto soll </w:t>
+      </w:r>
+      <w:r>
+        <w:t>sich Dynamisch zwischen den Spuren bewegen können</w:t>
+      </w:r>
+    </w:p>
+    <w:p>
+      <w:pPr>
+        <w:pStyle w:val="Listenabsatz"/>
+        <w:numPr>
+          <w:ilvl w:val="0"/>
+          <w:numId w:val="23"/>
+        </w:numPr>
+      </w:pPr>
+      <w:r>
+        <w:t xml:space="preserve">Nach </w:t>
+      </w:r>
+      <w:proofErr w:type="gramStart"/>
+      <w:r>
+        <w:t>Vorne</w:t>
+      </w:r>
+      <w:proofErr w:type="gramEnd"/>
+      <w:r>
+        <w:t xml:space="preserve">/ </w:t>
+      </w:r>
+      <w:proofErr w:type="gramStart"/>
+      <w:r>
+        <w:t>Hinten</w:t>
+      </w:r>
+      <w:proofErr w:type="gramEnd"/>
+      <w:r>
+        <w:t>/ Rechts/ Links</w:t>
+      </w:r>
+    </w:p>
+    <w:p>
+      <w:pPr>
+        <w:pStyle w:val="Listenabsatz"/>
+        <w:numPr>
+          <w:ilvl w:val="0"/>
+          <w:numId w:val="22"/>
+        </w:numPr>
+      </w:pPr>
+      <w:r>
+        <w:t>Die Hindernisse (Autos) sollen fest in ihren Spuren sein</w:t>
+      </w:r>
+    </w:p>
+    <w:p>
+      <w:pPr>
+        <w:pStyle w:val="Listenabsatz"/>
+        <w:numPr>
+          <w:ilvl w:val="0"/>
+          <w:numId w:val="23"/>
+        </w:numPr>
+      </w:pPr>
+      <w:r>
+        <w:t xml:space="preserve">Wechsel zwischen </w:t>
+      </w:r>
+      <w:proofErr w:type="spellStart"/>
+      <w:r>
+        <w:t>Fahrzeuggrössen</w:t>
+      </w:r>
+      <w:proofErr w:type="spellEnd"/>
+      <w:r>
+        <w:t xml:space="preserve"> (Abzug unterschiedliche Leben)</w:t>
+      </w:r>
+    </w:p>
+    <w:p>
+      <w:pPr>
+        <w:pStyle w:val="Listenabsatz"/>
+        <w:numPr>
+          <w:ilvl w:val="0"/>
+          <w:numId w:val="23"/>
+        </w:numPr>
+      </w:pPr>
+      <w:r>
+        <w:t xml:space="preserve">Autos wechseln nach gewisser Zeit auch </w:t>
+      </w:r>
+      <w:proofErr w:type="spellStart"/>
+      <w:r>
+        <w:t>auch</w:t>
+      </w:r>
+      <w:proofErr w:type="spellEnd"/>
+      <w:r>
+        <w:t xml:space="preserve"> die Spuren</w:t>
+      </w:r>
+    </w:p>
+    <w:p>
+      <w:pPr>
+        <w:pStyle w:val="Listenabsatz"/>
+        <w:numPr>
+          <w:ilvl w:val="0"/>
+          <w:numId w:val="23"/>
+        </w:numPr>
+      </w:pPr>
+      <w:proofErr w:type="gramStart"/>
+      <w:r>
+        <w:t>Polizei</w:t>
+      </w:r>
+      <w:proofErr w:type="gramEnd"/>
+      <w:r>
+        <w:t xml:space="preserve"> die durch das Spielfeld kommt und wenn erwischt spiel vorbei</w:t>
+      </w:r>
+    </w:p>
+    <w:p>
+      <w:pPr>
+        <w:pStyle w:val="Listenabsatz"/>
+        <w:numPr>
+          <w:ilvl w:val="0"/>
+          <w:numId w:val="22"/>
+        </w:numPr>
+      </w:pPr>
+      <w:proofErr w:type="spellStart"/>
+      <w:r>
+        <w:t>Speedboost</w:t>
+      </w:r>
+      <w:proofErr w:type="spellEnd"/>
+      <w:r>
+        <w:t xml:space="preserve"> über Tastenkombination</w:t>
+      </w:r>
+    </w:p>
+    <w:p>
+      <w:pPr>
+        <w:pStyle w:val="Listenabsatz"/>
+        <w:numPr>
+          <w:ilvl w:val="0"/>
+          <w:numId w:val="22"/>
+        </w:numPr>
+      </w:pPr>
+      <w:r>
+        <w:t>Items</w:t>
+      </w:r>
+      <w:r>
+        <w:t xml:space="preserve"> (werden gepickt und verwendet)</w:t>
+      </w:r>
+    </w:p>
+    <w:p>
+      <w:pPr>
+        <w:pStyle w:val="Listenabsatz"/>
+        <w:numPr>
+          <w:ilvl w:val="0"/>
+          <w:numId w:val="23"/>
+        </w:numPr>
+      </w:pPr>
+      <w:r>
+        <w:t xml:space="preserve">Vodka (Alkohol) Vertauschen der Pfeiltasten für paar </w:t>
+      </w:r>
+      <w:proofErr w:type="spellStart"/>
+      <w:r>
+        <w:t>sekunden</w:t>
+      </w:r>
+      <w:proofErr w:type="spellEnd"/>
+    </w:p>
+    <w:p>
+      <w:pPr>
+        <w:pStyle w:val="Listenabsatz"/>
+        <w:numPr>
+          <w:ilvl w:val="0"/>
+          <w:numId w:val="23"/>
+        </w:numPr>
+      </w:pPr>
+      <w:r>
+        <w:t>Stern (</w:t>
+      </w:r>
+      <w:proofErr w:type="spellStart"/>
+      <w:r>
+        <w:t>Mariokart</w:t>
+      </w:r>
+      <w:proofErr w:type="spellEnd"/>
+      <w:r>
+        <w:t>) Immunität</w:t>
+      </w:r>
+    </w:p>
+    <w:p>
+      <w:pPr>
+        <w:pStyle w:val="Listenabsatz"/>
+        <w:numPr>
+          <w:ilvl w:val="0"/>
+          <w:numId w:val="23"/>
+        </w:numPr>
+      </w:pPr>
+      <w:r>
+        <w:t xml:space="preserve">Uhr (Sanduhr) Zeitlupe für paar </w:t>
+      </w:r>
+      <w:proofErr w:type="spellStart"/>
+      <w:r>
+        <w:t>sekunden</w:t>
+      </w:r>
+      <w:proofErr w:type="spellEnd"/>
+    </w:p>
+    <w:p>
+      <w:pPr>
+        <w:pStyle w:val="Listenabsatz"/>
+        <w:numPr>
+          <w:ilvl w:val="0"/>
+          <w:numId w:val="23"/>
+        </w:numPr>
+      </w:pPr>
+      <w:proofErr w:type="gramStart"/>
+      <w:r>
+        <w:t>Extra Leben</w:t>
+      </w:r>
+      <w:proofErr w:type="gramEnd"/>
+      <w:r>
+        <w:t xml:space="preserve"> (</w:t>
+      </w:r>
+      <w:proofErr w:type="spellStart"/>
+      <w:r>
+        <w:t>Werkzeigkasten</w:t>
+      </w:r>
+      <w:proofErr w:type="spellEnd"/>
+      <w:r>
+        <w:t>)</w:t>
+      </w:r>
+    </w:p>
+    <w:p>
+      <w:pPr>
+        <w:pStyle w:val="Listenabsatz"/>
+        <w:numPr>
+          <w:ilvl w:val="0"/>
+          <w:numId w:val="22"/>
+        </w:numPr>
+      </w:pPr>
+      <w:r>
+        <w:t xml:space="preserve">Brücke </w:t>
+      </w:r>
+      <w:proofErr w:type="gramStart"/>
+      <w:r>
+        <w:t>die Teil</w:t>
+      </w:r>
+      <w:proofErr w:type="gramEnd"/>
+      <w:r>
+        <w:t xml:space="preserve"> des Spielfeldes verdeckt und dadurch man die Autos nicht sieht</w:t>
+      </w:r>
+    </w:p>
+    <w:p>
+      <w:pPr>
+        <w:pStyle w:val="Listenabsatz"/>
+        <w:numPr>
+          <w:ilvl w:val="0"/>
+          <w:numId w:val="22"/>
+        </w:numPr>
+      </w:pPr>
+      <w:r>
+        <w:t xml:space="preserve">Nach gewisser Zeit Polizei kommt dir auf die Schliche </w:t>
+      </w:r>
+    </w:p>
+    <w:p>
+      <w:pPr>
+        <w:pStyle w:val="Listenabsatz"/>
+        <w:numPr>
+          <w:ilvl w:val="0"/>
+          <w:numId w:val="23"/>
+        </w:numPr>
+      </w:pPr>
+      <w:r>
+        <w:t xml:space="preserve">Verkehr dreht sich und du fährst mit doppelter </w:t>
+      </w:r>
+      <w:proofErr w:type="spellStart"/>
+      <w:r>
+        <w:t>geschwindigkeit</w:t>
+      </w:r>
+      <w:proofErr w:type="spellEnd"/>
+      <w:r>
+        <w:t xml:space="preserve"> mit Verkehr</w:t>
+      </w:r>
+    </w:p>
+    <w:p>
+      <w:pPr>
+        <w:pStyle w:val="Listenabsatz"/>
+      </w:pPr>
+    </w:p>
+    <w:p>
+      <w:pPr>
+        <w:pStyle w:val="Listenabsatz"/>
+      </w:pPr>
+    </w:p>
+    <w:p>
+      <w:pPr>
+        <w:pStyle w:val="Listenabsatz"/>
+      </w:pPr>
+    </w:p>
+    <w:p>
+      <w:pPr>
+        <w:pStyle w:val="berschrift1"/>
+      </w:pPr>
+      <w:r>
+        <w:t>Umsetzung</w:t>
+      </w:r>
+    </w:p>
+    <w:p>
+      <w:pPr>
+        <w:pStyle w:val="Listenabsatz"/>
+        <w:numPr>
+          <w:ilvl w:val="0"/>
+          <w:numId w:val="26"/>
+        </w:numPr>
+      </w:pPr>
+      <w:r>
+        <w:t>Fahrspuren</w:t>
+      </w:r>
+      <w:r>
+        <w:t>, Unterschiedliche Autos mit Lebensabzug</w:t>
+      </w:r>
+    </w:p>
+    <w:p>
+      <w:pPr>
+        <w:pStyle w:val="Listenabsatz"/>
+        <w:numPr>
+          <w:ilvl w:val="0"/>
+          <w:numId w:val="26"/>
+        </w:numPr>
+      </w:pPr>
+      <w:r>
+        <w:t>Start und Endscreen</w:t>
+      </w:r>
+    </w:p>
+    <w:p>
+      <w:pPr>
+        <w:pStyle w:val="Listenabsatz"/>
+        <w:numPr>
+          <w:ilvl w:val="0"/>
+          <w:numId w:val="26"/>
+        </w:numPr>
+      </w:pPr>
+      <w:r>
+        <w:t xml:space="preserve">Funktionen des </w:t>
+      </w:r>
+      <w:proofErr w:type="spellStart"/>
+      <w:r>
+        <w:t>screens</w:t>
+      </w:r>
+      <w:proofErr w:type="spellEnd"/>
+      <w:r>
+        <w:t xml:space="preserve"> </w:t>
+      </w:r>
+      <w:r>
+        <w:t xml:space="preserve">(Musik-Auswahl, Scoreboard, Anleitung mit Storyline, Skin Auswahl, Start, Randparameter </w:t>
+      </w:r>
+      <w:proofErr w:type="spellStart"/>
+      <w:r>
+        <w:t>wahl</w:t>
+      </w:r>
+      <w:proofErr w:type="spellEnd"/>
+      <w:r>
+        <w:t xml:space="preserve"> (wieviel </w:t>
+      </w:r>
+      <w:proofErr w:type="spellStart"/>
+      <w:r>
+        <w:t>autos</w:t>
+      </w:r>
+      <w:proofErr w:type="spellEnd"/>
+      <w:r>
+        <w:t>, wie schnell,</w:t>
+      </w:r>
+      <w:proofErr w:type="gramStart"/>
+      <w:r>
+        <w:t>) )</w:t>
+      </w:r>
+      <w:proofErr w:type="gramEnd"/>
+    </w:p>
+    <w:p>
+      <w:pPr>
+        <w:pStyle w:val="Listenabsatz"/>
+        <w:numPr>
+          <w:ilvl w:val="0"/>
+          <w:numId w:val="26"/>
+        </w:numPr>
+      </w:pPr>
+      <w:r>
+        <w:t>Items</w:t>
+      </w:r>
+    </w:p>
+    <w:p>
+      <w:pPr>
+        <w:pStyle w:val="Listenabsatz"/>
+        <w:numPr>
+          <w:ilvl w:val="0"/>
+          <w:numId w:val="26"/>
+        </w:numPr>
+      </w:pPr>
+      <w:r>
+        <w:lastRenderedPageBreak/>
+        <w:t>Brücke mit Polizei</w:t>
+      </w:r>
+    </w:p>
+    <w:p>
+      <w:pPr>
+        <w:pStyle w:val="Listenabsatz"/>
+        <w:numPr>
+          <w:ilvl w:val="0"/>
+          <w:numId w:val="26"/>
+        </w:numPr>
+      </w:pPr>
+      <w:r>
+        <w:t>Implementierung von Freischaltbaren Skins</w:t>
+      </w:r>
     </w:p>
     <w:p>
       <w:pPr>
@@ -3546,6 +4038,119 @@
     </w:lvl>
   </w:abstractNum>
   <w:abstractNum w:abstractNumId="14" w15:restartNumberingAfterBreak="0">
+    <w:nsid w:val="45593C11"/>
+    <w:multiLevelType w:val="hybridMultilevel"/>
+    <w:tmpl w:val="C2C8FD7C"/>
+    <w:lvl w:ilvl="0" w:tplc="07361C30">
+      <w:start w:val="1"/>
+      <w:numFmt w:val="bullet"/>
+      <w:lvlText w:val="-"/>
+      <w:lvlJc w:val="left"/>
+      <w:pPr>
+        <w:ind w:left="720" w:hanging="360"/>
+      </w:pPr>
+      <w:rPr>
+        <w:rFonts w:ascii="Arial" w:eastAsia="Times New Roman" w:hAnsi="Arial" w:cs="Arial" w:hint="default"/>
+      </w:rPr>
+    </w:lvl>
+    <w:lvl w:ilvl="1" w:tplc="04070003" w:tentative="1">
+      <w:start w:val="1"/>
+      <w:numFmt w:val="bullet"/>
+      <w:lvlText w:val="o"/>
+      <w:lvlJc w:val="left"/>
+      <w:pPr>
+        <w:ind w:left="1440" w:hanging="360"/>
+      </w:pPr>
+      <w:rPr>
+        <w:rFonts w:ascii="Courier New" w:hAnsi="Courier New" w:cs="Courier New" w:hint="default"/>
+      </w:rPr>
+    </w:lvl>
+    <w:lvl w:ilvl="2" w:tplc="04070005" w:tentative="1">
+      <w:start w:val="1"/>
+      <w:numFmt w:val="bullet"/>
+      <w:lvlText w:val=""/>
+      <w:lvlJc w:val="left"/>
+      <w:pPr>
+        <w:ind w:left="2160" w:hanging="360"/>
+      </w:pPr>
+      <w:rPr>
+        <w:rFonts w:ascii="Wingdings" w:hAnsi="Wingdings" w:hint="default"/>
+      </w:rPr>
+    </w:lvl>
+    <w:lvl w:ilvl="3" w:tplc="04070001" w:tentative="1">
+      <w:start w:val="1"/>
+      <w:numFmt w:val="bullet"/>
+      <w:lvlText w:val=""/>
+      <w:lvlJc w:val="left"/>
+      <w:pPr>
+        <w:ind w:left="2880" w:hanging="360"/>
+      </w:pPr>
+      <w:rPr>
+        <w:rFonts w:ascii="Symbol" w:hAnsi="Symbol" w:hint="default"/>
+      </w:rPr>
+    </w:lvl>
+    <w:lvl w:ilvl="4" w:tplc="04070003" w:tentative="1">
+      <w:start w:val="1"/>
+      <w:numFmt w:val="bullet"/>
+      <w:lvlText w:val="o"/>
+      <w:lvlJc w:val="left"/>
+      <w:pPr>
+        <w:ind w:left="3600" w:hanging="360"/>
+      </w:pPr>
+      <w:rPr>
+        <w:rFonts w:ascii="Courier New" w:hAnsi="Courier New" w:cs="Courier New" w:hint="default"/>
+      </w:rPr>
+    </w:lvl>
+    <w:lvl w:ilvl="5" w:tplc="04070005" w:tentative="1">
+      <w:start w:val="1"/>
+      <w:numFmt w:val="bullet"/>
+      <w:lvlText w:val=""/>
+      <w:lvlJc w:val="left"/>
+      <w:pPr>
+        <w:ind w:left="4320" w:hanging="360"/>
+      </w:pPr>
+      <w:rPr>
+        <w:rFonts w:ascii="Wingdings" w:hAnsi="Wingdings" w:hint="default"/>
+      </w:rPr>
+    </w:lvl>
+    <w:lvl w:ilvl="6" w:tplc="04070001" w:tentative="1">
+      <w:start w:val="1"/>
+      <w:numFmt w:val="bullet"/>
+      <w:lvlText w:val=""/>
+      <w:lvlJc w:val="left"/>
+      <w:pPr>
+        <w:ind w:left="5040" w:hanging="360"/>
+      </w:pPr>
+      <w:rPr>
+        <w:rFonts w:ascii="Symbol" w:hAnsi="Symbol" w:hint="default"/>
+      </w:rPr>
+    </w:lvl>
+    <w:lvl w:ilvl="7" w:tplc="04070003" w:tentative="1">
+      <w:start w:val="1"/>
+      <w:numFmt w:val="bullet"/>
+      <w:lvlText w:val="o"/>
+      <w:lvlJc w:val="left"/>
+      <w:pPr>
+        <w:ind w:left="5760" w:hanging="360"/>
+      </w:pPr>
+      <w:rPr>
+        <w:rFonts w:ascii="Courier New" w:hAnsi="Courier New" w:cs="Courier New" w:hint="default"/>
+      </w:rPr>
+    </w:lvl>
+    <w:lvl w:ilvl="8" w:tplc="04070005" w:tentative="1">
+      <w:start w:val="1"/>
+      <w:numFmt w:val="bullet"/>
+      <w:lvlText w:val=""/>
+      <w:lvlJc w:val="left"/>
+      <w:pPr>
+        <w:ind w:left="6480" w:hanging="360"/>
+      </w:pPr>
+      <w:rPr>
+        <w:rFonts w:ascii="Wingdings" w:hAnsi="Wingdings" w:hint="default"/>
+      </w:rPr>
+    </w:lvl>
+  </w:abstractNum>
+  <w:abstractNum w:abstractNumId="15" w15:restartNumberingAfterBreak="0">
     <w:nsid w:val="49D66CF5"/>
     <w:multiLevelType w:val="hybridMultilevel"/>
     <w:tmpl w:val="589847A2"/>
@@ -3634,7 +4239,7 @@
       </w:pPr>
     </w:lvl>
   </w:abstractNum>
-  <w:abstractNum w:abstractNumId="15" w15:restartNumberingAfterBreak="0">
+  <w:abstractNum w:abstractNumId="16" w15:restartNumberingAfterBreak="0">
     <w:nsid w:val="4B967EE4"/>
     <w:multiLevelType w:val="hybridMultilevel"/>
     <w:tmpl w:val="AB44CA96"/>
@@ -3747,7 +4352,7 @@
       </w:rPr>
     </w:lvl>
   </w:abstractNum>
-  <w:abstractNum w:abstractNumId="16" w15:restartNumberingAfterBreak="0">
+  <w:abstractNum w:abstractNumId="17" w15:restartNumberingAfterBreak="0">
     <w:nsid w:val="4FBA5F9F"/>
     <w:multiLevelType w:val="hybridMultilevel"/>
     <w:tmpl w:val="E658519E"/>
@@ -3860,7 +4465,96 @@
       </w:rPr>
     </w:lvl>
   </w:abstractNum>
-  <w:abstractNum w:abstractNumId="17" w15:restartNumberingAfterBreak="0">
+  <w:abstractNum w:abstractNumId="18" w15:restartNumberingAfterBreak="0">
+    <w:nsid w:val="52217154"/>
+    <w:multiLevelType w:val="hybridMultilevel"/>
+    <w:tmpl w:val="9D681A7E"/>
+    <w:lvl w:ilvl="0" w:tplc="0407000F">
+      <w:start w:val="1"/>
+      <w:numFmt w:val="decimal"/>
+      <w:lvlText w:val="%1."/>
+      <w:lvlJc w:val="left"/>
+      <w:pPr>
+        <w:ind w:left="720" w:hanging="360"/>
+      </w:pPr>
+      <w:rPr>
+        <w:rFonts w:hint="default"/>
+      </w:rPr>
+    </w:lvl>
+    <w:lvl w:ilvl="1" w:tplc="04070019" w:tentative="1">
+      <w:start w:val="1"/>
+      <w:numFmt w:val="lowerLetter"/>
+      <w:lvlText w:val="%2."/>
+      <w:lvlJc w:val="left"/>
+      <w:pPr>
+        <w:ind w:left="1440" w:hanging="360"/>
+      </w:pPr>
+    </w:lvl>
+    <w:lvl w:ilvl="2" w:tplc="0407001B" w:tentative="1">
+      <w:start w:val="1"/>
+      <w:numFmt w:val="lowerRoman"/>
+      <w:lvlText w:val="%3."/>
+      <w:lvlJc w:val="right"/>
+      <w:pPr>
+        <w:ind w:left="2160" w:hanging="180"/>
+      </w:pPr>
+    </w:lvl>
+    <w:lvl w:ilvl="3" w:tplc="0407000F" w:tentative="1">
+      <w:start w:val="1"/>
+      <w:numFmt w:val="decimal"/>
+      <w:lvlText w:val="%4."/>
+      <w:lvlJc w:val="left"/>
+      <w:pPr>
+        <w:ind w:left="2880" w:hanging="360"/>
+      </w:pPr>
+    </w:lvl>
+    <w:lvl w:ilvl="4" w:tplc="04070019" w:tentative="1">
+      <w:start w:val="1"/>
+      <w:numFmt w:val="lowerLetter"/>
+      <w:lvlText w:val="%5."/>
+      <w:lvlJc w:val="left"/>
+      <w:pPr>
+        <w:ind w:left="3600" w:hanging="360"/>
+      </w:pPr>
+    </w:lvl>
+    <w:lvl w:ilvl="5" w:tplc="0407001B" w:tentative="1">
+      <w:start w:val="1"/>
+      <w:numFmt w:val="lowerRoman"/>
+      <w:lvlText w:val="%6."/>
+      <w:lvlJc w:val="right"/>
+      <w:pPr>
+        <w:ind w:left="4320" w:hanging="180"/>
+      </w:pPr>
+    </w:lvl>
+    <w:lvl w:ilvl="6" w:tplc="0407000F" w:tentative="1">
+      <w:start w:val="1"/>
+      <w:numFmt w:val="decimal"/>
+      <w:lvlText w:val="%7."/>
+      <w:lvlJc w:val="left"/>
+      <w:pPr>
+        <w:ind w:left="5040" w:hanging="360"/>
+      </w:pPr>
+    </w:lvl>
+    <w:lvl w:ilvl="7" w:tplc="04070019" w:tentative="1">
+      <w:start w:val="1"/>
+      <w:numFmt w:val="lowerLetter"/>
+      <w:lvlText w:val="%8."/>
+      <w:lvlJc w:val="left"/>
+      <w:pPr>
+        <w:ind w:left="5760" w:hanging="360"/>
+      </w:pPr>
+    </w:lvl>
+    <w:lvl w:ilvl="8" w:tplc="0407001B" w:tentative="1">
+      <w:start w:val="1"/>
+      <w:numFmt w:val="lowerRoman"/>
+      <w:lvlText w:val="%9."/>
+      <w:lvlJc w:val="right"/>
+      <w:pPr>
+        <w:ind w:left="6480" w:hanging="180"/>
+      </w:pPr>
+    </w:lvl>
+  </w:abstractNum>
+  <w:abstractNum w:abstractNumId="19" w15:restartNumberingAfterBreak="0">
     <w:nsid w:val="56594B19"/>
     <w:multiLevelType w:val="hybridMultilevel"/>
     <w:tmpl w:val="13260482"/>
@@ -3949,7 +4643,7 @@
       </w:pPr>
     </w:lvl>
   </w:abstractNum>
-  <w:abstractNum w:abstractNumId="18" w15:restartNumberingAfterBreak="0">
+  <w:abstractNum w:abstractNumId="20" w15:restartNumberingAfterBreak="0">
     <w:nsid w:val="5C8514A2"/>
     <w:multiLevelType w:val="hybridMultilevel"/>
     <w:tmpl w:val="39F6EBB4"/>
@@ -4038,7 +4732,7 @@
       </w:pPr>
     </w:lvl>
   </w:abstractNum>
-  <w:abstractNum w:abstractNumId="19" w15:restartNumberingAfterBreak="0">
+  <w:abstractNum w:abstractNumId="21" w15:restartNumberingAfterBreak="0">
     <w:nsid w:val="60294E37"/>
     <w:multiLevelType w:val="hybridMultilevel"/>
     <w:tmpl w:val="870A21C6"/>
@@ -4151,7 +4845,122 @@
       </w:rPr>
     </w:lvl>
   </w:abstractNum>
-  <w:abstractNum w:abstractNumId="20" w15:restartNumberingAfterBreak="0">
+  <w:abstractNum w:abstractNumId="22" w15:restartNumberingAfterBreak="0">
+    <w:nsid w:val="6DBF0D80"/>
+    <w:multiLevelType w:val="hybridMultilevel"/>
+    <w:tmpl w:val="7F2E88D0"/>
+    <w:lvl w:ilvl="0" w:tplc="48101C06">
+      <w:start w:val="1"/>
+      <w:numFmt w:val="bullet"/>
+      <w:lvlText w:val="-"/>
+      <w:lvlJc w:val="left"/>
+      <w:pPr>
+        <w:ind w:left="720" w:hanging="360"/>
+      </w:pPr>
+      <w:rPr>
+        <w:rFonts w:ascii="Arial" w:eastAsia="Times New Roman" w:hAnsi="Arial" w:cs="Arial" w:hint="default"/>
+        <w:b/>
+        <w:sz w:val="28"/>
+      </w:rPr>
+    </w:lvl>
+    <w:lvl w:ilvl="1" w:tplc="04070003" w:tentative="1">
+      <w:start w:val="1"/>
+      <w:numFmt w:val="bullet"/>
+      <w:lvlText w:val="o"/>
+      <w:lvlJc w:val="left"/>
+      <w:pPr>
+        <w:ind w:left="1440" w:hanging="360"/>
+      </w:pPr>
+      <w:rPr>
+        <w:rFonts w:ascii="Courier New" w:hAnsi="Courier New" w:cs="Courier New" w:hint="default"/>
+      </w:rPr>
+    </w:lvl>
+    <w:lvl w:ilvl="2" w:tplc="04070005" w:tentative="1">
+      <w:start w:val="1"/>
+      <w:numFmt w:val="bullet"/>
+      <w:lvlText w:val=""/>
+      <w:lvlJc w:val="left"/>
+      <w:pPr>
+        <w:ind w:left="2160" w:hanging="360"/>
+      </w:pPr>
+      <w:rPr>
+        <w:rFonts w:ascii="Wingdings" w:hAnsi="Wingdings" w:hint="default"/>
+      </w:rPr>
+    </w:lvl>
+    <w:lvl w:ilvl="3" w:tplc="04070001" w:tentative="1">
+      <w:start w:val="1"/>
+      <w:numFmt w:val="bullet"/>
+      <w:lvlText w:val=""/>
+      <w:lvlJc w:val="left"/>
+      <w:pPr>
+        <w:ind w:left="2880" w:hanging="360"/>
+      </w:pPr>
+      <w:rPr>
+        <w:rFonts w:ascii="Symbol" w:hAnsi="Symbol" w:hint="default"/>
+      </w:rPr>
+    </w:lvl>
+    <w:lvl w:ilvl="4" w:tplc="04070003" w:tentative="1">
+      <w:start w:val="1"/>
+      <w:numFmt w:val="bullet"/>
+      <w:lvlText w:val="o"/>
+      <w:lvlJc w:val="left"/>
+      <w:pPr>
+        <w:ind w:left="3600" w:hanging="360"/>
+      </w:pPr>
+      <w:rPr>
+        <w:rFonts w:ascii="Courier New" w:hAnsi="Courier New" w:cs="Courier New" w:hint="default"/>
+      </w:rPr>
+    </w:lvl>
+    <w:lvl w:ilvl="5" w:tplc="04070005" w:tentative="1">
+      <w:start w:val="1"/>
+      <w:numFmt w:val="bullet"/>
+      <w:lvlText w:val=""/>
+      <w:lvlJc w:val="left"/>
+      <w:pPr>
+        <w:ind w:left="4320" w:hanging="360"/>
+      </w:pPr>
+      <w:rPr>
+        <w:rFonts w:ascii="Wingdings" w:hAnsi="Wingdings" w:hint="default"/>
+      </w:rPr>
+    </w:lvl>
+    <w:lvl w:ilvl="6" w:tplc="04070001" w:tentative="1">
+      <w:start w:val="1"/>
+      <w:numFmt w:val="bullet"/>
+      <w:lvlText w:val=""/>
+      <w:lvlJc w:val="left"/>
+      <w:pPr>
+        <w:ind w:left="5040" w:hanging="360"/>
+      </w:pPr>
+      <w:rPr>
+        <w:rFonts w:ascii="Symbol" w:hAnsi="Symbol" w:hint="default"/>
+      </w:rPr>
+    </w:lvl>
+    <w:lvl w:ilvl="7" w:tplc="04070003" w:tentative="1">
+      <w:start w:val="1"/>
+      <w:numFmt w:val="bullet"/>
+      <w:lvlText w:val="o"/>
+      <w:lvlJc w:val="left"/>
+      <w:pPr>
+        <w:ind w:left="5760" w:hanging="360"/>
+      </w:pPr>
+      <w:rPr>
+        <w:rFonts w:ascii="Courier New" w:hAnsi="Courier New" w:cs="Courier New" w:hint="default"/>
+      </w:rPr>
+    </w:lvl>
+    <w:lvl w:ilvl="8" w:tplc="04070005" w:tentative="1">
+      <w:start w:val="1"/>
+      <w:numFmt w:val="bullet"/>
+      <w:lvlText w:val=""/>
+      <w:lvlJc w:val="left"/>
+      <w:pPr>
+        <w:ind w:left="6480" w:hanging="360"/>
+      </w:pPr>
+      <w:rPr>
+        <w:rFonts w:ascii="Wingdings" w:hAnsi="Wingdings" w:hint="default"/>
+      </w:rPr>
+    </w:lvl>
+  </w:abstractNum>
+  <w:abstractNum w:abstractNumId="23" w15:restartNumberingAfterBreak="0">
     <w:nsid w:val="79A45B78"/>
     <w:multiLevelType w:val="hybridMultilevel"/>
     <w:tmpl w:val="D56E8468"/>
@@ -4264,7 +5073,7 @@
       </w:rPr>
     </w:lvl>
   </w:abstractNum>
-  <w:abstractNum w:abstractNumId="21" w15:restartNumberingAfterBreak="0">
+  <w:abstractNum w:abstractNumId="24" w15:restartNumberingAfterBreak="0">
     <w:nsid w:val="7B693DF1"/>
     <w:multiLevelType w:val="multilevel"/>
     <w:tmpl w:val="0A5E1AFC"/>
@@ -4377,7 +5186,7 @@
       </w:rPr>
     </w:lvl>
   </w:abstractNum>
-  <w:abstractNum w:abstractNumId="22" w15:restartNumberingAfterBreak="0">
+  <w:abstractNum w:abstractNumId="25" w15:restartNumberingAfterBreak="0">
     <w:nsid w:val="7CBE57E8"/>
     <w:multiLevelType w:val="multilevel"/>
     <w:tmpl w:val="CC823A7A"/>
@@ -4492,22 +5301,22 @@
     </w:lvl>
   </w:abstractNum>
   <w:num w:numId="1" w16cid:durableId="1339693363">
-    <w:abstractNumId w:val="22"/>
+    <w:abstractNumId w:val="25"/>
   </w:num>
   <w:num w:numId="2" w16cid:durableId="1313873075">
-    <w:abstractNumId w:val="14"/>
+    <w:abstractNumId w:val="15"/>
   </w:num>
   <w:num w:numId="3" w16cid:durableId="1073628963">
-    <w:abstractNumId w:val="21"/>
+    <w:abstractNumId w:val="24"/>
   </w:num>
   <w:num w:numId="4" w16cid:durableId="1620644336">
-    <w:abstractNumId w:val="17"/>
+    <w:abstractNumId w:val="19"/>
   </w:num>
   <w:num w:numId="5" w16cid:durableId="1819225459">
     <w:abstractNumId w:val="12"/>
   </w:num>
   <w:num w:numId="6" w16cid:durableId="396126666">
-    <w:abstractNumId w:val="19"/>
+    <w:abstractNumId w:val="21"/>
   </w:num>
   <w:num w:numId="7" w16cid:durableId="1635060064">
     <w:abstractNumId w:val="13"/>
@@ -4543,22 +5352,31 @@
     <w:abstractNumId w:val="9"/>
   </w:num>
   <w:num w:numId="18" w16cid:durableId="941111679">
-    <w:abstractNumId w:val="16"/>
+    <w:abstractNumId w:val="17"/>
   </w:num>
   <w:num w:numId="19" w16cid:durableId="1628849920">
-    <w:abstractNumId w:val="18"/>
+    <w:abstractNumId w:val="20"/>
   </w:num>
   <w:num w:numId="20" w16cid:durableId="2079739783">
     <w:abstractNumId w:val="10"/>
   </w:num>
   <w:num w:numId="21" w16cid:durableId="1084305012">
-    <w:abstractNumId w:val="15"/>
+    <w:abstractNumId w:val="16"/>
   </w:num>
   <w:num w:numId="22" w16cid:durableId="1501195645">
     <w:abstractNumId w:val="11"/>
   </w:num>
   <w:num w:numId="23" w16cid:durableId="876087238">
-    <w:abstractNumId w:val="20"/>
+    <w:abstractNumId w:val="23"/>
+  </w:num>
+  <w:num w:numId="24" w16cid:durableId="759448494">
+    <w:abstractNumId w:val="22"/>
+  </w:num>
+  <w:num w:numId="25" w16cid:durableId="2135979379">
+    <w:abstractNumId w:val="14"/>
+  </w:num>
+  <w:num w:numId="26" w16cid:durableId="1181821576">
+    <w:abstractNumId w:val="18"/>
   </w:num>
 </w:numbering>
 </file>

</xml_diff>

<commit_message>
Grammatik korrigiert und Einführung verfasst
</commit_message>
<xml_diff>
--- a/Doku/ Doku Program.docx
+++ b/Doku/ Doku Program.docx
@@ -331,10 +331,7 @@
               <w:tab/>
             </w:r>
             <w:r>
-              <w:t xml:space="preserve">7006161 / 2480084 / </w:t>
-            </w:r>
-            <w:r>
-              <w:t xml:space="preserve">9482671 </w:t>
+              <w:t xml:space="preserve">7006161 / 2480084 / 9482671 </w:t>
             </w:r>
           </w:p>
           <w:p>
@@ -810,91 +807,235 @@
     </w:p>
     <w:p>
       <w:pPr>
-        <w:pStyle w:val="Listenabsatz"/>
-        <w:numPr>
-          <w:ilvl w:val="0"/>
-          <w:numId w:val="25"/>
-        </w:numPr>
-      </w:pPr>
-      <w:r>
-        <w:t xml:space="preserve">Wir haben mit </w:t>
+        <w:pStyle w:val="StandardWeb"/>
+        <w:rPr>
+          <w:bCs/>
+        </w:rPr>
+      </w:pPr>
+      <w:r>
+        <w:rPr>
+          <w:bCs/>
+        </w:rPr>
+        <w:t>Im Rahmen dieses Projekts entwickeln wir in einer 3er-Gruppe ein Spiel in Microsoft Visual Studio unter der Verwendung der Programmiersprache Visual Basic. Das Spiel trägt den Namen „Falschfahrer mit Demenz“ und wird gemeinschaftlich geplant und umgesetzt.</w:t>
+      </w:r>
+    </w:p>
+    <w:p>
+      <w:pPr>
+        <w:tabs>
+          <w:tab w:val="clear" w:pos="1134"/>
+          <w:tab w:val="clear" w:pos="2268"/>
+        </w:tabs>
+        <w:spacing w:before="100" w:beforeAutospacing="1" w:after="100" w:afterAutospacing="1" w:line="240" w:lineRule="auto"/>
+        <w:rPr>
+          <w:rFonts w:ascii="Times New Roman" w:hAnsi="Times New Roman"/>
+          <w:color w:val="000000"/>
+          <w:sz w:val="24"/>
+          <w:szCs w:val="24"/>
+        </w:rPr>
+      </w:pPr>
+      <w:r>
+        <w:rPr>
+          <w:rFonts w:ascii="Times New Roman" w:hAnsi="Times New Roman"/>
+          <w:color w:val="000000"/>
+          <w:sz w:val="24"/>
+          <w:szCs w:val="24"/>
+        </w:rPr>
+        <w:t>Zur Koordination, Kommunikation sowie zum gemeinsamen Verwalten und Teilen des Entwicklungsprozesses nutzen wir GitHub, wodurch eine interaktive und realitätsnahe Arbeitsumgebung geschaffen wird. Der Großteil des Codes wurde eigenständig entwickelt. Künstliche Intelligenz kam lediglich unterstützend für Recherchezwecke oder bei kleineren Hilfestellungen zum Einsatz.</w:t>
+      </w:r>
+    </w:p>
+    <w:p>
+      <w:pPr>
+        <w:tabs>
+          <w:tab w:val="clear" w:pos="1134"/>
+          <w:tab w:val="clear" w:pos="2268"/>
+        </w:tabs>
+        <w:spacing w:before="100" w:beforeAutospacing="1" w:after="100" w:afterAutospacing="1" w:line="240" w:lineRule="auto"/>
+        <w:rPr>
+          <w:rFonts w:ascii="Times New Roman" w:hAnsi="Times New Roman"/>
+          <w:color w:val="000000"/>
+          <w:sz w:val="24"/>
+          <w:szCs w:val="24"/>
+        </w:rPr>
+      </w:pPr>
+      <w:r>
+        <w:rPr>
+          <w:rFonts w:ascii="Times New Roman" w:hAnsi="Times New Roman"/>
+          <w:color w:val="000000"/>
+          <w:sz w:val="24"/>
+          <w:szCs w:val="24"/>
+        </w:rPr>
+        <w:t xml:space="preserve">Wir haben uns im Entscheidungsprozess zwischen zwei unterschiedlichen Spieltheorien entschieden. Die Entscheidung lag zwischen einem Spiel, bei dem man Pollen ausweichen musste, da dies sehr gut zu unserer Gruppe passen würde, da wir alle Allergiker sind, sowie einem Spiel, bei dem man als Falschfahrer Autos ausweichen muss. Dies wurde eher im Arcade-Style programmiert, sodass es einen in die Zeit der </w:t>
       </w:r>
       <w:proofErr w:type="spellStart"/>
       <w:r>
-        <w:t>Github</w:t>
+        <w:rPr>
+          <w:rFonts w:ascii="Times New Roman" w:hAnsi="Times New Roman"/>
+          <w:color w:val="000000"/>
+          <w:sz w:val="24"/>
+          <w:szCs w:val="24"/>
+        </w:rPr>
+        <w:t>Arcades</w:t>
       </w:r>
       <w:proofErr w:type="spellEnd"/>
       <w:r>
-        <w:t xml:space="preserve"> in einem 3-er </w:t>
-      </w:r>
-      <w:r>
-        <w:t>T</w:t>
-      </w:r>
-      <w:r>
-        <w:t>eam gearbeitet</w:t>
-      </w:r>
-    </w:p>
-    <w:p>
-      <w:pPr>
-        <w:pStyle w:val="Listenabsatz"/>
-        <w:numPr>
-          <w:ilvl w:val="0"/>
-          <w:numId w:val="25"/>
-        </w:numPr>
-      </w:pPr>
-      <w:r>
-        <w:t xml:space="preserve">Wir haben KI zur </w:t>
-      </w:r>
-      <w:r>
-        <w:t>Recherchezwecken und zur Hilfestellung benutzt</w:t>
-      </w:r>
-    </w:p>
-    <w:p>
-      <w:pPr>
-        <w:spacing w:line="360" w:lineRule="auto"/>
-        <w:jc w:val="both"/>
-        <w:rPr>
-          <w:bCs/>
-          <w:sz w:val="24"/>
-          <w:szCs w:val="24"/>
-        </w:rPr>
-      </w:pPr>
-    </w:p>
-    <w:p>
-      <w:pPr>
-        <w:pStyle w:val="berschrift2"/>
-        <w:spacing w:line="360" w:lineRule="auto"/>
-        <w:rPr>
-          <w:rFonts w:ascii="Arial" w:hAnsi="Arial" w:cs="Arial"/>
+        <w:rPr>
+          <w:rFonts w:ascii="Times New Roman" w:hAnsi="Times New Roman"/>
+          <w:color w:val="000000"/>
+          <w:sz w:val="24"/>
+          <w:szCs w:val="24"/>
+        </w:rPr>
+        <w:t xml:space="preserve"> und Early Nintendos zurückversetzt. Diese zwei Ideen haben wir mit einer Nutzwertanalyse gegeneinander abgewogen und haben uns anhand dieser für eine Idee entschieden.</w:t>
+      </w:r>
+    </w:p>
+    <w:p>
+      <w:pPr>
+        <w:tabs>
+          <w:tab w:val="clear" w:pos="1134"/>
+          <w:tab w:val="clear" w:pos="2268"/>
+        </w:tabs>
+        <w:spacing w:before="100" w:beforeAutospacing="1" w:after="100" w:afterAutospacing="1" w:line="240" w:lineRule="auto"/>
+        <w:rPr>
+          <w:rFonts w:ascii="Times New Roman" w:hAnsi="Times New Roman"/>
+          <w:color w:val="000000"/>
+          <w:sz w:val="24"/>
+          <w:szCs w:val="24"/>
+          <w:shd w:val="clear" w:color="auto" w:fill="FFFF00"/>
+        </w:rPr>
+      </w:pPr>
+      <w:r>
+        <w:rPr>
+          <w:rFonts w:ascii="Times New Roman" w:hAnsi="Times New Roman"/>
+          <w:color w:val="000000"/>
+          <w:sz w:val="24"/>
+          <w:szCs w:val="24"/>
+        </w:rPr>
+        <w:t xml:space="preserve">Die Entscheidung fiel auf das Falschfahrer-Prinzip im Arcade-Style. Das Spiel soll einem mit einem </w:t>
+      </w:r>
+      <w:proofErr w:type="spellStart"/>
+      <w:r>
+        <w:rPr>
+          <w:rFonts w:ascii="Times New Roman" w:hAnsi="Times New Roman"/>
+          <w:color w:val="000000"/>
+          <w:sz w:val="24"/>
+          <w:szCs w:val="24"/>
+        </w:rPr>
+        <w:t>cinematischen</w:t>
+      </w:r>
+      <w:proofErr w:type="spellEnd"/>
+      <w:r>
+        <w:rPr>
+          <w:rFonts w:ascii="Times New Roman" w:hAnsi="Times New Roman"/>
+          <w:color w:val="000000"/>
+          <w:sz w:val="24"/>
+          <w:szCs w:val="24"/>
+        </w:rPr>
+        <w:t xml:space="preserve"> oder MP3</w:t>
+      </w:r>
+      <w:r>
+        <w:rPr>
+          <w:rFonts w:ascii="Times New Roman" w:hAnsi="Times New Roman"/>
+          <w:color w:val="000000"/>
+          <w:sz w:val="24"/>
+          <w:szCs w:val="24"/>
+        </w:rPr>
+        <w:noBreakHyphen/>
+        <w:t xml:space="preserve">Intro erläutern, wie man es überhaupt geschafft hat, in diese Situation zu kommen. Danach soll man in das Menü kommen, wo man das Spiel für sich anpassen kann (Farbe des Autos/Musik). Des </w:t>
+      </w:r>
+      <w:proofErr w:type="spellStart"/>
+      <w:r>
+        <w:rPr>
+          <w:rFonts w:ascii="Times New Roman" w:hAnsi="Times New Roman"/>
+          <w:color w:val="000000"/>
+          <w:sz w:val="24"/>
+          <w:szCs w:val="24"/>
+        </w:rPr>
+        <w:t>Weiteren</w:t>
+      </w:r>
+      <w:proofErr w:type="spellEnd"/>
+      <w:r>
+        <w:rPr>
+          <w:rFonts w:ascii="Times New Roman" w:hAnsi="Times New Roman"/>
+          <w:color w:val="000000"/>
+          <w:sz w:val="24"/>
+          <w:szCs w:val="24"/>
+        </w:rPr>
+        <w:t xml:space="preserve"> kann man hier auch nochmal die Regeln nachlesen sowie die Highscores einsehen und das Spiel starten. Das Spiel soll sich an der groben Theorie „Space Invaders“ orientieren. Das </w:t>
+      </w:r>
+      <w:r>
+        <w:rPr>
+          <w:rFonts w:ascii="Times New Roman" w:hAnsi="Times New Roman"/>
+          <w:color w:val="000000"/>
+          <w:sz w:val="24"/>
+          <w:szCs w:val="24"/>
+        </w:rPr>
+        <w:t>selbst</w:t>
+      </w:r>
+      <w:r>
+        <w:rPr>
+          <w:rFonts w:ascii="Times New Roman" w:hAnsi="Times New Roman"/>
+          <w:color w:val="000000"/>
+          <w:sz w:val="24"/>
+          <w:szCs w:val="24"/>
+        </w:rPr>
+        <w:t xml:space="preserve"> gesteuerte Auto kann sich in jede Richtung bewegen, wobei von oben Hindernisse entgegenkommen und sich der Spieler durchschlängeln muss. Es gibt Items, die einem bei diesem Prozess helfen oder einen auch behindern können. Sobald alle Leben verloren wurden, kommt ein Game-Over-Screen und der Spieler kriegt die Auswahl, ob er nochmal spielen will, zurück zum Hauptmenü will oder weiterspielen will für </w:t>
+      </w:r>
+      <w:r>
+        <w:rPr>
+          <w:rFonts w:ascii="Times New Roman" w:hAnsi="Times New Roman"/>
+          <w:color w:val="000000"/>
+          <w:sz w:val="24"/>
+          <w:szCs w:val="24"/>
+          <w:shd w:val="clear" w:color="auto" w:fill="FFFF00"/>
+        </w:rPr>
+        <w:t>Schlüssel, die im Game eingesammelt werden können.</w:t>
+      </w:r>
+    </w:p>
+    <w:p>
+      <w:pPr>
+        <w:tabs>
+          <w:tab w:val="clear" w:pos="1134"/>
+          <w:tab w:val="clear" w:pos="2268"/>
+        </w:tabs>
+        <w:spacing w:after="160" w:line="259" w:lineRule="auto"/>
+        <w:rPr>
+          <w:rFonts w:cs="Arial"/>
           <w:b/>
           <w:bCs/>
-          <w:color w:val="auto"/>
           <w:sz w:val="28"/>
           <w:szCs w:val="28"/>
           <w:lang w:val="en-US"/>
         </w:rPr>
       </w:pPr>
+      <w:r>
+        <w:rPr>
+          <w:rFonts w:ascii="Times New Roman" w:hAnsi="Times New Roman"/>
+          <w:color w:val="000000"/>
+          <w:sz w:val="27"/>
+          <w:szCs w:val="27"/>
+          <w:shd w:val="clear" w:color="auto" w:fill="FFFF00"/>
+        </w:rPr>
+        <w:br w:type="page"/>
+      </w:r>
       <w:bookmarkStart w:id="5" w:name="_Toc140144483"/>
       <w:bookmarkStart w:id="6" w:name="_Toc140151407"/>
       <w:bookmarkStart w:id="7" w:name="_Toc228971804"/>
       <w:r>
         <w:rPr>
-          <w:rFonts w:ascii="Arial" w:hAnsi="Arial" w:cs="Arial"/>
+          <w:rFonts w:cs="Arial"/>
           <w:b/>
           <w:bCs/>
-          <w:color w:val="auto"/>
           <w:sz w:val="28"/>
           <w:szCs w:val="28"/>
           <w:lang w:val="en-US"/>
         </w:rPr>
+        <w:lastRenderedPageBreak/>
         <w:t>Abst</w:t>
       </w:r>
       <w:r>
         <w:rPr>
-          <w:rFonts w:ascii="Arial" w:hAnsi="Arial" w:cs="Arial"/>
+          <w:rFonts w:cs="Arial"/>
           <w:b/>
           <w:bCs/>
-          <w:color w:val="auto"/>
           <w:sz w:val="28"/>
           <w:szCs w:val="28"/>
           <w:lang w:val="en-US"/>
@@ -905,10 +1046,9 @@
       <w:bookmarkEnd w:id="6"/>
       <w:r>
         <w:rPr>
-          <w:rFonts w:ascii="Arial" w:hAnsi="Arial" w:cs="Arial"/>
+          <w:rFonts w:cs="Arial"/>
           <w:b/>
           <w:bCs/>
-          <w:color w:val="auto"/>
           <w:sz w:val="28"/>
           <w:szCs w:val="28"/>
           <w:lang w:val="en-US"/>
@@ -916,6 +1056,246 @@
         <w:t xml:space="preserve"> of the Project</w:t>
       </w:r>
       <w:bookmarkEnd w:id="7"/>
+    </w:p>
+    <w:p>
+      <w:pPr>
+        <w:rPr>
+          <w:rFonts w:ascii="Times New Roman" w:hAnsi="Times New Roman"/>
+          <w:sz w:val="24"/>
+          <w:szCs w:val="24"/>
+          <w:lang w:val="en-US"/>
+        </w:rPr>
+      </w:pPr>
+      <w:r>
+        <w:rPr>
+          <w:rFonts w:ascii="Times New Roman" w:hAnsi="Times New Roman"/>
+          <w:sz w:val="24"/>
+          <w:szCs w:val="24"/>
+          <w:lang w:val="en-US"/>
+        </w:rPr>
+        <w:t>As part of this project, we are working in groups of three to develop a game in Microsoft Visual Studio using the Visual Basic programming language. The game is called “The Wrong-Way Driver with Dementia” and is being planned and developed collaboratively.</w:t>
+      </w:r>
+    </w:p>
+    <w:p>
+      <w:pPr>
+        <w:rPr>
+          <w:rFonts w:ascii="Times New Roman" w:hAnsi="Times New Roman"/>
+          <w:sz w:val="24"/>
+          <w:szCs w:val="24"/>
+          <w:lang w:val="en-US"/>
+        </w:rPr>
+      </w:pPr>
+    </w:p>
+    <w:p>
+      <w:pPr>
+        <w:rPr>
+          <w:rFonts w:ascii="Times New Roman" w:hAnsi="Times New Roman"/>
+          <w:sz w:val="24"/>
+          <w:szCs w:val="24"/>
+          <w:lang w:val="en-US"/>
+        </w:rPr>
+      </w:pPr>
+      <w:r>
+        <w:rPr>
+          <w:rFonts w:ascii="Times New Roman" w:hAnsi="Times New Roman"/>
+          <w:sz w:val="24"/>
+          <w:szCs w:val="24"/>
+          <w:lang w:val="en-US"/>
+        </w:rPr>
+        <w:t xml:space="preserve">We use GitHub for coordination, communication, and the joint management and sharing of the development process, which creates an interactive and realistic work environment. </w:t>
+      </w:r>
+      <w:proofErr w:type="gramStart"/>
+      <w:r>
+        <w:rPr>
+          <w:rFonts w:ascii="Times New Roman" w:hAnsi="Times New Roman"/>
+          <w:sz w:val="24"/>
+          <w:szCs w:val="24"/>
+          <w:lang w:val="en-US"/>
+        </w:rPr>
+        <w:t>The majority of</w:t>
+      </w:r>
+      <w:proofErr w:type="gramEnd"/>
+      <w:r>
+        <w:rPr>
+          <w:rFonts w:ascii="Times New Roman" w:hAnsi="Times New Roman"/>
+          <w:sz w:val="24"/>
+          <w:szCs w:val="24"/>
+          <w:lang w:val="en-US"/>
+        </w:rPr>
+        <w:t xml:space="preserve"> the code was developed in-house. Artificial intelligence was used only to assist with research or to provide minor support</w:t>
+      </w:r>
+    </w:p>
+    <w:p>
+      <w:pPr>
+        <w:rPr>
+          <w:rFonts w:ascii="Times New Roman" w:hAnsi="Times New Roman"/>
+          <w:sz w:val="24"/>
+          <w:szCs w:val="24"/>
+          <w:lang w:val="en-US"/>
+        </w:rPr>
+      </w:pPr>
+    </w:p>
+    <w:p>
+      <w:pPr>
+        <w:rPr>
+          <w:rFonts w:ascii="Times New Roman" w:hAnsi="Times New Roman"/>
+          <w:sz w:val="24"/>
+          <w:szCs w:val="24"/>
+          <w:lang w:val="en-US"/>
+        </w:rPr>
+      </w:pPr>
+      <w:r>
+        <w:rPr>
+          <w:rFonts w:ascii="Times New Roman" w:hAnsi="Times New Roman"/>
+          <w:sz w:val="24"/>
+          <w:szCs w:val="24"/>
+          <w:lang w:val="en-US"/>
+        </w:rPr>
+        <w:t xml:space="preserve">During the decision-making process, we chose between two different game concepts. The choice was between a game where you had to dodge pollen—which would be a great fit for our group since we all have allergies—and a game where you </w:t>
+      </w:r>
+      <w:proofErr w:type="gramStart"/>
+      <w:r>
+        <w:rPr>
+          <w:rFonts w:ascii="Times New Roman" w:hAnsi="Times New Roman"/>
+          <w:sz w:val="24"/>
+          <w:szCs w:val="24"/>
+          <w:lang w:val="en-US"/>
+        </w:rPr>
+        <w:t>have to</w:t>
+      </w:r>
+      <w:proofErr w:type="gramEnd"/>
+      <w:r>
+        <w:rPr>
+          <w:rFonts w:ascii="Times New Roman" w:hAnsi="Times New Roman"/>
+          <w:sz w:val="24"/>
+          <w:szCs w:val="24"/>
+          <w:lang w:val="en-US"/>
+        </w:rPr>
+        <w:t xml:space="preserve"> dodge cars while driving the wrong way. The latter was programmed in a more arcade-style, taking you back to the days of arcades and early Nintendo.</w:t>
+      </w:r>
+      <w:r>
+        <w:rPr>
+          <w:rFonts w:ascii="Times New Roman" w:hAnsi="Times New Roman"/>
+          <w:sz w:val="24"/>
+          <w:szCs w:val="24"/>
+          <w:lang w:val="en-US"/>
+        </w:rPr>
+        <w:t xml:space="preserve"> </w:t>
+      </w:r>
+      <w:r>
+        <w:rPr>
+          <w:rFonts w:ascii="Times New Roman" w:hAnsi="Times New Roman"/>
+          <w:sz w:val="24"/>
+          <w:szCs w:val="24"/>
+          <w:lang w:val="en-US"/>
+        </w:rPr>
+        <w:t xml:space="preserve">We weighed these two ideas against each other using a cost-benefit analysis </w:t>
+      </w:r>
+      <w:proofErr w:type="gramStart"/>
+      <w:r>
+        <w:rPr>
+          <w:rFonts w:ascii="Times New Roman" w:hAnsi="Times New Roman"/>
+          <w:sz w:val="24"/>
+          <w:szCs w:val="24"/>
+          <w:lang w:val="en-US"/>
+        </w:rPr>
+        <w:t>and,</w:t>
+      </w:r>
+      <w:proofErr w:type="gramEnd"/>
+      <w:r>
+        <w:rPr>
+          <w:rFonts w:ascii="Times New Roman" w:hAnsi="Times New Roman"/>
+          <w:sz w:val="24"/>
+          <w:szCs w:val="24"/>
+          <w:lang w:val="en-US"/>
+        </w:rPr>
+        <w:t xml:space="preserve"> based on that, decided on one of them.</w:t>
+      </w:r>
+    </w:p>
+    <w:p>
+      <w:pPr>
+        <w:rPr>
+          <w:rFonts w:ascii="Times New Roman" w:hAnsi="Times New Roman"/>
+          <w:sz w:val="24"/>
+          <w:szCs w:val="24"/>
+          <w:lang w:val="en-US"/>
+        </w:rPr>
+      </w:pPr>
+      <w:r>
+        <w:rPr>
+          <w:rFonts w:ascii="Times New Roman" w:hAnsi="Times New Roman"/>
+          <w:sz w:val="24"/>
+          <w:szCs w:val="24"/>
+          <w:lang w:val="en-US"/>
+        </w:rPr>
+        <w:t xml:space="preserve"> </w:t>
+      </w:r>
+    </w:p>
+    <w:p>
+      <w:pPr>
+        <w:rPr>
+          <w:rFonts w:ascii="Times New Roman" w:hAnsi="Times New Roman"/>
+          <w:sz w:val="24"/>
+          <w:szCs w:val="24"/>
+          <w:lang w:val="en-US"/>
+        </w:rPr>
+      </w:pPr>
+      <w:r>
+        <w:rPr>
+          <w:rFonts w:ascii="Times New Roman" w:hAnsi="Times New Roman"/>
+          <w:sz w:val="24"/>
+          <w:szCs w:val="24"/>
+          <w:lang w:val="en-US"/>
+        </w:rPr>
+        <w:t>The decision was made to go with the "driving the wrong way" concept in an arcade style. The game will start with a cinematic or MP3 intro explaining how you ended up in this situation in the first place. After that, you’ll enter the menu, where you can customize the game (car color/music). You can also review the rules, check the high scores, and start the game.</w:t>
+      </w:r>
+    </w:p>
+    <w:p>
+      <w:pPr>
+        <w:rPr>
+          <w:rFonts w:ascii="Times New Roman" w:hAnsi="Times New Roman"/>
+          <w:sz w:val="24"/>
+          <w:szCs w:val="24"/>
+          <w:lang w:val="en-US"/>
+        </w:rPr>
+      </w:pPr>
+    </w:p>
+    <w:p>
+      <w:pPr>
+        <w:rPr>
+          <w:rFonts w:ascii="Times New Roman" w:hAnsi="Times New Roman"/>
+          <w:sz w:val="24"/>
+          <w:szCs w:val="24"/>
+          <w:lang w:val="en-US"/>
+        </w:rPr>
+      </w:pPr>
+      <w:r>
+        <w:rPr>
+          <w:rFonts w:ascii="Times New Roman" w:hAnsi="Times New Roman"/>
+          <w:sz w:val="24"/>
+          <w:szCs w:val="24"/>
+          <w:lang w:val="en-US"/>
+        </w:rPr>
+        <w:t>The game is based on the basic concept of "Space Invaders." The player-controlled car can move in any direction, while obstacles approach from above, and the player must weave through them. There are items that can either help or hinder the player in this process.</w:t>
+      </w:r>
+      <w:r>
+        <w:rPr>
+          <w:rFonts w:ascii="Times New Roman" w:hAnsi="Times New Roman"/>
+          <w:sz w:val="24"/>
+          <w:szCs w:val="24"/>
+          <w:lang w:val="en-US"/>
+        </w:rPr>
+        <w:t xml:space="preserve"> </w:t>
+      </w:r>
+      <w:r>
+        <w:rPr>
+          <w:rFonts w:ascii="Times New Roman" w:hAnsi="Times New Roman"/>
+          <w:sz w:val="24"/>
+          <w:szCs w:val="24"/>
+          <w:lang w:val="en-US"/>
+        </w:rPr>
+        <w:t>Once all lives have been lost, a "Game Over" screen appears, and the player is given the option to play again, return to the main menu, or continue playing to collect keys that can be gathered in the game.</w:t>
+      </w:r>
     </w:p>
     <w:p>
       <w:pPr>
@@ -930,35 +1310,6 @@
           <w:lang w:val="en-US"/>
         </w:rPr>
       </w:pPr>
-      <w:r>
-        <w:rPr>
-          <w:bCs/>
-          <w:sz w:val="24"/>
-          <w:szCs w:val="24"/>
-          <w:lang w:val="en-US"/>
-        </w:rPr>
-        <w:t>(</w:t>
-      </w:r>
-      <w:proofErr w:type="spellStart"/>
-      <w:r>
-        <w:rPr>
-          <w:bCs/>
-          <w:sz w:val="24"/>
-          <w:szCs w:val="24"/>
-          <w:lang w:val="en-US"/>
-        </w:rPr>
-        <w:t>imput</w:t>
-      </w:r>
-      <w:proofErr w:type="spellEnd"/>
-      <w:r>
-        <w:rPr>
-          <w:bCs/>
-          <w:sz w:val="24"/>
-          <w:szCs w:val="24"/>
-          <w:lang w:val="en-US"/>
-        </w:rPr>
-        <w:t xml:space="preserve"> English Version her)</w:t>
-      </w:r>
       <w:r>
         <w:rPr>
           <w:rFonts w:cs="Arial"/>
@@ -1643,16 +1994,21 @@
         <w:t>Vorüberlegungen zur Lösung</w:t>
       </w:r>
     </w:p>
-    <w:p/>
     <w:p>
       <w:pPr>
         <w:pStyle w:val="Listenabsatz"/>
         <w:numPr>
           <w:ilvl w:val="0"/>
-          <w:numId w:val="21"/>
+          <w:numId w:val="27"/>
         </w:numPr>
       </w:pPr>
       <w:r>
+        <w:rPr>
+          <w:rFonts w:ascii="Times New Roman" w:hAnsi="Times New Roman"/>
+          <w:color w:val="000000"/>
+          <w:sz w:val="24"/>
+          <w:szCs w:val="24"/>
+        </w:rPr>
         <w:t>Wir könnten ein Spiel machen, wo wir uns durch Polen bewegen müssen</w:t>
       </w:r>
     </w:p>
@@ -1661,19 +2017,37 @@
         <w:pStyle w:val="Listenabsatz"/>
         <w:numPr>
           <w:ilvl w:val="0"/>
-          <w:numId w:val="22"/>
+          <w:numId w:val="28"/>
         </w:numPr>
       </w:pPr>
       <w:r>
-        <w:t xml:space="preserve">Treffer lösen eine Nies- oder </w:t>
+        <w:rPr>
+          <w:rFonts w:ascii="Times New Roman" w:hAnsi="Times New Roman"/>
+          <w:color w:val="000000"/>
+          <w:sz w:val="24"/>
+          <w:szCs w:val="24"/>
+        </w:rPr>
+        <w:t xml:space="preserve">Treffer lösen einen Nies- oder </w:t>
       </w:r>
       <w:proofErr w:type="spellStart"/>
       <w:r>
-        <w:t>Psst</w:t>
+        <w:rPr>
+          <w:rFonts w:ascii="Times New Roman" w:hAnsi="Times New Roman"/>
+          <w:color w:val="000000"/>
+          <w:sz w:val="24"/>
+          <w:szCs w:val="24"/>
+        </w:rPr>
+        <w:t>Pssst</w:t>
       </w:r>
       <w:proofErr w:type="spellEnd"/>
       <w:r>
-        <w:t xml:space="preserve"> Sound aus</w:t>
+        <w:rPr>
+          <w:rFonts w:ascii="Times New Roman" w:hAnsi="Times New Roman"/>
+          <w:color w:val="000000"/>
+          <w:sz w:val="24"/>
+          <w:szCs w:val="24"/>
+        </w:rPr>
+        <w:t>-Sound aus.</w:t>
       </w:r>
     </w:p>
     <w:p>
@@ -1681,28 +2055,44 @@
         <w:pStyle w:val="Listenabsatz"/>
         <w:numPr>
           <w:ilvl w:val="0"/>
-          <w:numId w:val="22"/>
+          <w:numId w:val="28"/>
         </w:numPr>
       </w:pPr>
       <w:r>
-        <w:t xml:space="preserve">Beim Game Over kommt eine Tabellenpackung mit Anti </w:t>
-      </w:r>
-      <w:proofErr w:type="spellStart"/>
-      <w:r>
-        <w:t>Allergikum</w:t>
-      </w:r>
-      <w:proofErr w:type="spellEnd"/>
+        <w:rPr>
+          <w:rFonts w:ascii="Times New Roman" w:hAnsi="Times New Roman"/>
+          <w:color w:val="000000"/>
+          <w:sz w:val="24"/>
+          <w:szCs w:val="24"/>
+        </w:rPr>
+        <w:t>Beim Game Over kommt eine Tablettenpackung mit Antiallergikum</w:t>
+      </w:r>
+      <w:r>
+        <w:rPr>
+          <w:rFonts w:ascii="Times New Roman" w:hAnsi="Times New Roman"/>
+          <w:color w:val="000000"/>
+          <w:sz w:val="24"/>
+          <w:szCs w:val="24"/>
+        </w:rPr>
+        <w:t>.</w:t>
+      </w:r>
     </w:p>
     <w:p>
       <w:pPr>
         <w:pStyle w:val="Listenabsatz"/>
         <w:numPr>
           <w:ilvl w:val="0"/>
-          <w:numId w:val="22"/>
+          <w:numId w:val="28"/>
         </w:numPr>
       </w:pPr>
       <w:r>
-        <w:t>Ein spiel knapp 1-2 Minuten eine Vorlesung (Ranking in überlebten Vorlesungen)</w:t>
+        <w:rPr>
+          <w:rFonts w:ascii="Times New Roman" w:hAnsi="Times New Roman"/>
+          <w:color w:val="000000"/>
+          <w:sz w:val="24"/>
+          <w:szCs w:val="24"/>
+        </w:rPr>
+        <w:t>Ein spiel knapp 1–2 Minuten, eine Vorlesung (Ranking in überlebten Vorlesungen)</w:t>
       </w:r>
     </w:p>
     <w:p>
@@ -1710,15 +2100,27 @@
         <w:pStyle w:val="Listenabsatz"/>
         <w:numPr>
           <w:ilvl w:val="0"/>
-          <w:numId w:val="22"/>
+          <w:numId w:val="28"/>
         </w:numPr>
       </w:pPr>
       <w:proofErr w:type="spellStart"/>
       <w:r>
+        <w:rPr>
+          <w:rFonts w:ascii="Times New Roman" w:hAnsi="Times New Roman"/>
+          <w:color w:val="000000"/>
+          <w:sz w:val="24"/>
+          <w:szCs w:val="24"/>
+        </w:rPr>
         <w:t>Powerups</w:t>
       </w:r>
       <w:proofErr w:type="spellEnd"/>
       <w:r>
+        <w:rPr>
+          <w:rFonts w:ascii="Times New Roman" w:hAnsi="Times New Roman"/>
+          <w:color w:val="000000"/>
+          <w:sz w:val="24"/>
+          <w:szCs w:val="24"/>
+        </w:rPr>
         <w:t xml:space="preserve"> (Inventar oder Sofort-Use)</w:t>
       </w:r>
     </w:p>
@@ -1727,11 +2129,17 @@
         <w:pStyle w:val="Listenabsatz"/>
         <w:numPr>
           <w:ilvl w:val="0"/>
-          <w:numId w:val="23"/>
+          <w:numId w:val="29"/>
         </w:numPr>
       </w:pPr>
       <w:r>
-        <w:t>Tabletten (Funktion wie Bombe Sprengung von Hindernissen)</w:t>
+        <w:rPr>
+          <w:rFonts w:ascii="Times New Roman" w:hAnsi="Times New Roman"/>
+          <w:color w:val="000000"/>
+          <w:sz w:val="24"/>
+          <w:szCs w:val="24"/>
+        </w:rPr>
+        <w:t>Tabletten (Funktion wie Bombensprengung von Hindernissen)</w:t>
       </w:r>
     </w:p>
     <w:p>
@@ -1739,11 +2147,17 @@
         <w:pStyle w:val="Listenabsatz"/>
         <w:numPr>
           <w:ilvl w:val="0"/>
-          <w:numId w:val="23"/>
+          <w:numId w:val="29"/>
         </w:numPr>
       </w:pPr>
       <w:r>
-        <w:t>FFP2 Maske (Immun gegen alles für 3 Sekunden)</w:t>
+        <w:rPr>
+          <w:rFonts w:ascii="Times New Roman" w:hAnsi="Times New Roman"/>
+          <w:color w:val="000000"/>
+          <w:sz w:val="24"/>
+          <w:szCs w:val="24"/>
+        </w:rPr>
+        <w:t>FFP2-Maske (immun gegen alles für 3 Sekunden)</w:t>
       </w:r>
     </w:p>
     <w:p>
@@ -1751,7 +2165,7 @@
         <w:pStyle w:val="Listenabsatz"/>
         <w:numPr>
           <w:ilvl w:val="0"/>
-          <w:numId w:val="22"/>
+          <w:numId w:val="28"/>
         </w:numPr>
       </w:pPr>
       <w:r>
@@ -1763,17 +2177,37 @@
         <w:pStyle w:val="Listenabsatz"/>
         <w:numPr>
           <w:ilvl w:val="0"/>
-          <w:numId w:val="23"/>
+          <w:numId w:val="29"/>
         </w:numPr>
-      </w:pPr>
-      <w:r>
-        <w:t>Stoßlüften</w:t>
-      </w:r>
-      <w:r>
-        <w:t xml:space="preserve"> (5 Sek schnellere </w:t>
+        <w:tabs>
+          <w:tab w:val="clear" w:pos="1134"/>
+          <w:tab w:val="clear" w:pos="2268"/>
+        </w:tabs>
+        <w:spacing w:before="100" w:beforeAutospacing="1" w:after="100" w:afterAutospacing="1" w:line="240" w:lineRule="auto"/>
+        <w:rPr>
+          <w:rFonts w:ascii="Times New Roman" w:hAnsi="Times New Roman"/>
+          <w:color w:val="000000"/>
+          <w:sz w:val="24"/>
+          <w:szCs w:val="24"/>
+        </w:rPr>
+      </w:pPr>
+      <w:r>
+        <w:rPr>
+          <w:rFonts w:ascii="Times New Roman" w:hAnsi="Times New Roman"/>
+          <w:color w:val="000000"/>
+          <w:sz w:val="24"/>
+          <w:szCs w:val="24"/>
+        </w:rPr>
+        <w:t xml:space="preserve">Stoßlüften (5 Sek. schnellere </w:t>
       </w:r>
       <w:proofErr w:type="gramStart"/>
       <w:r>
+        <w:rPr>
+          <w:rFonts w:ascii="Times New Roman" w:hAnsi="Times New Roman"/>
+          <w:color w:val="000000"/>
+          <w:sz w:val="24"/>
+          <w:szCs w:val="24"/>
+        </w:rPr>
         <w:t>Hindernisse )</w:t>
       </w:r>
       <w:proofErr w:type="gramEnd"/>
@@ -1783,10 +2217,27 @@
         <w:pStyle w:val="Listenabsatz"/>
         <w:numPr>
           <w:ilvl w:val="0"/>
-          <w:numId w:val="22"/>
+          <w:numId w:val="28"/>
         </w:numPr>
-      </w:pPr>
-      <w:r>
+        <w:tabs>
+          <w:tab w:val="clear" w:pos="1134"/>
+          <w:tab w:val="clear" w:pos="2268"/>
+        </w:tabs>
+        <w:spacing w:before="100" w:beforeAutospacing="1" w:after="100" w:afterAutospacing="1" w:line="240" w:lineRule="auto"/>
+        <w:rPr>
+          <w:rFonts w:ascii="Times New Roman" w:hAnsi="Times New Roman"/>
+          <w:color w:val="000000"/>
+          <w:sz w:val="24"/>
+          <w:szCs w:val="24"/>
+        </w:rPr>
+      </w:pPr>
+      <w:r>
+        <w:rPr>
+          <w:rFonts w:ascii="Times New Roman" w:hAnsi="Times New Roman"/>
+          <w:color w:val="000000"/>
+          <w:sz w:val="24"/>
+          <w:szCs w:val="24"/>
+        </w:rPr>
         <w:t>Startscreen</w:t>
       </w:r>
     </w:p>
@@ -1795,19 +2246,28 @@
         <w:pStyle w:val="Listenabsatz"/>
         <w:numPr>
           <w:ilvl w:val="0"/>
-          <w:numId w:val="23"/>
+          <w:numId w:val="29"/>
         </w:numPr>
-      </w:pPr>
-      <w:r>
-        <w:t xml:space="preserve">Animiert mit 3 Bildern die </w:t>
-      </w:r>
-      <w:proofErr w:type="spellStart"/>
-      <w:r>
-        <w:t>Rotierne</w:t>
-      </w:r>
-      <w:proofErr w:type="spellEnd"/>
-      <w:r>
-        <w:t xml:space="preserve"> weg bis zum Niesen</w:t>
+        <w:tabs>
+          <w:tab w:val="clear" w:pos="1134"/>
+          <w:tab w:val="clear" w:pos="2268"/>
+        </w:tabs>
+        <w:spacing w:before="100" w:beforeAutospacing="1" w:after="100" w:afterAutospacing="1" w:line="240" w:lineRule="auto"/>
+        <w:rPr>
+          <w:rFonts w:ascii="Times New Roman" w:hAnsi="Times New Roman"/>
+          <w:color w:val="000000"/>
+          <w:sz w:val="24"/>
+          <w:szCs w:val="24"/>
+        </w:rPr>
+      </w:pPr>
+      <w:r>
+        <w:rPr>
+          <w:rFonts w:ascii="Times New Roman" w:hAnsi="Times New Roman"/>
+          <w:color w:val="000000"/>
+          <w:sz w:val="24"/>
+          <w:szCs w:val="24"/>
+        </w:rPr>
+        <w:t>Animiert mit 3 Bildern die rotierenden weg bis zum Niesen</w:t>
       </w:r>
     </w:p>
     <w:p>
@@ -1815,17 +2275,45 @@
         <w:pStyle w:val="Listenabsatz"/>
         <w:numPr>
           <w:ilvl w:val="0"/>
-          <w:numId w:val="22"/>
+          <w:numId w:val="28"/>
         </w:numPr>
-      </w:pPr>
-      <w:r>
+        <w:tabs>
+          <w:tab w:val="clear" w:pos="1134"/>
+          <w:tab w:val="clear" w:pos="2268"/>
+        </w:tabs>
+        <w:spacing w:before="100" w:beforeAutospacing="1" w:after="100" w:afterAutospacing="1" w:line="240" w:lineRule="auto"/>
+        <w:rPr>
+          <w:rFonts w:ascii="Times New Roman" w:hAnsi="Times New Roman"/>
+          <w:color w:val="000000"/>
+          <w:sz w:val="24"/>
+          <w:szCs w:val="24"/>
+        </w:rPr>
+      </w:pPr>
+      <w:r>
+        <w:rPr>
+          <w:rFonts w:ascii="Times New Roman" w:hAnsi="Times New Roman"/>
+          <w:color w:val="000000"/>
+          <w:sz w:val="24"/>
+          <w:szCs w:val="24"/>
+        </w:rPr>
         <w:t>Intro Voice wo das alles wie ein Intro erklärt</w:t>
       </w:r>
     </w:p>
     <w:p>
       <w:pPr>
         <w:pStyle w:val="Listenabsatz"/>
+        <w:tabs>
+          <w:tab w:val="clear" w:pos="1134"/>
+          <w:tab w:val="clear" w:pos="2268"/>
+        </w:tabs>
+        <w:spacing w:before="100" w:beforeAutospacing="1" w:after="100" w:afterAutospacing="1" w:line="240" w:lineRule="auto"/>
         <w:ind w:left="1080"/>
+        <w:rPr>
+          <w:rFonts w:ascii="Times New Roman" w:hAnsi="Times New Roman"/>
+          <w:color w:val="000000"/>
+          <w:sz w:val="24"/>
+          <w:szCs w:val="24"/>
+        </w:rPr>
       </w:pPr>
     </w:p>
     <w:p>
@@ -1833,11 +2321,28 @@
         <w:pStyle w:val="Listenabsatz"/>
         <w:numPr>
           <w:ilvl w:val="0"/>
-          <w:numId w:val="21"/>
+          <w:numId w:val="27"/>
         </w:numPr>
-      </w:pPr>
-      <w:r>
-        <w:t xml:space="preserve">Wir könnten ein Spiel machen wo wir uns als Falschfahrer auf der Autobahn </w:t>
+        <w:tabs>
+          <w:tab w:val="clear" w:pos="1134"/>
+          <w:tab w:val="clear" w:pos="2268"/>
+        </w:tabs>
+        <w:spacing w:before="100" w:beforeAutospacing="1" w:after="100" w:afterAutospacing="1" w:line="240" w:lineRule="auto"/>
+        <w:rPr>
+          <w:rFonts w:ascii="Times New Roman" w:hAnsi="Times New Roman"/>
+          <w:color w:val="000000"/>
+          <w:sz w:val="24"/>
+          <w:szCs w:val="24"/>
+        </w:rPr>
+      </w:pPr>
+      <w:r>
+        <w:rPr>
+          <w:rFonts w:ascii="Times New Roman" w:hAnsi="Times New Roman"/>
+          <w:color w:val="000000"/>
+          <w:sz w:val="24"/>
+          <w:szCs w:val="24"/>
+        </w:rPr>
+        <w:t>Wir könnten ein Spiel machen, wo wir uns als Falschfahrer auf der Autobahn </w:t>
       </w:r>
     </w:p>
     <w:p>
@@ -1845,10 +2350,27 @@
         <w:pStyle w:val="Listenabsatz"/>
         <w:numPr>
           <w:ilvl w:val="0"/>
-          <w:numId w:val="22"/>
+          <w:numId w:val="28"/>
         </w:numPr>
-      </w:pPr>
-      <w:r>
+        <w:tabs>
+          <w:tab w:val="clear" w:pos="1134"/>
+          <w:tab w:val="clear" w:pos="2268"/>
+        </w:tabs>
+        <w:spacing w:before="100" w:beforeAutospacing="1" w:after="100" w:afterAutospacing="1" w:line="240" w:lineRule="auto"/>
+        <w:rPr>
+          <w:rFonts w:ascii="Times New Roman" w:hAnsi="Times New Roman"/>
+          <w:color w:val="000000"/>
+          <w:sz w:val="24"/>
+          <w:szCs w:val="24"/>
+        </w:rPr>
+      </w:pPr>
+      <w:r>
+        <w:rPr>
+          <w:rFonts w:ascii="Times New Roman" w:hAnsi="Times New Roman"/>
+          <w:color w:val="000000"/>
+          <w:sz w:val="24"/>
+          <w:szCs w:val="24"/>
+        </w:rPr>
         <w:t>Auto könnte aus mehreren Pixeln bestehen</w:t>
       </w:r>
     </w:p>
@@ -1857,10 +2379,27 @@
         <w:pStyle w:val="Listenabsatz"/>
         <w:numPr>
           <w:ilvl w:val="0"/>
-          <w:numId w:val="22"/>
+          <w:numId w:val="28"/>
         </w:numPr>
-      </w:pPr>
-      <w:r>
+        <w:tabs>
+          <w:tab w:val="clear" w:pos="1134"/>
+          <w:tab w:val="clear" w:pos="2268"/>
+        </w:tabs>
+        <w:spacing w:before="100" w:beforeAutospacing="1" w:after="100" w:afterAutospacing="1" w:line="240" w:lineRule="auto"/>
+        <w:rPr>
+          <w:rFonts w:ascii="Times New Roman" w:hAnsi="Times New Roman"/>
+          <w:color w:val="000000"/>
+          <w:sz w:val="24"/>
+          <w:szCs w:val="24"/>
+        </w:rPr>
+      </w:pPr>
+      <w:r>
+        <w:rPr>
+          <w:rFonts w:ascii="Times New Roman" w:hAnsi="Times New Roman"/>
+          <w:color w:val="000000"/>
+          <w:sz w:val="24"/>
+          <w:szCs w:val="24"/>
+        </w:rPr>
         <w:t>Spielfeld wird in Spuren aufgeteilt</w:t>
       </w:r>
     </w:p>
@@ -1869,11 +2408,46 @@
         <w:pStyle w:val="Listenabsatz"/>
         <w:numPr>
           <w:ilvl w:val="0"/>
-          <w:numId w:val="23"/>
+          <w:numId w:val="29"/>
         </w:numPr>
-      </w:pPr>
-      <w:r>
+        <w:tabs>
+          <w:tab w:val="clear" w:pos="1134"/>
+          <w:tab w:val="clear" w:pos="2268"/>
+        </w:tabs>
+        <w:spacing w:before="100" w:beforeAutospacing="1" w:after="100" w:afterAutospacing="1" w:line="240" w:lineRule="auto"/>
+        <w:rPr>
+          <w:rFonts w:ascii="Times New Roman" w:hAnsi="Times New Roman"/>
+          <w:color w:val="000000"/>
+          <w:sz w:val="24"/>
+          <w:szCs w:val="24"/>
+        </w:rPr>
+      </w:pPr>
+      <w:r>
+        <w:rPr>
+          <w:rFonts w:ascii="Times New Roman" w:hAnsi="Times New Roman"/>
+          <w:color w:val="000000"/>
+          <w:sz w:val="24"/>
+          <w:szCs w:val="24"/>
+        </w:rPr>
         <w:t>Visuelle Abgrenzung der Spuren durch striche</w:t>
+      </w:r>
+      <w:r>
+        <w:rPr>
+          <w:rFonts w:ascii="Times New Roman" w:hAnsi="Times New Roman"/>
+          <w:color w:val="000000"/>
+          <w:sz w:val="14"/>
+          <w:szCs w:val="14"/>
+        </w:rPr>
+        <w:t>  </w:t>
+      </w:r>
+      <w:r>
+        <w:rPr>
+          <w:rFonts w:ascii="Times New Roman" w:hAnsi="Times New Roman"/>
+          <w:color w:val="000000"/>
+          <w:sz w:val="24"/>
+          <w:szCs w:val="24"/>
+        </w:rPr>
+        <w:t> </w:t>
       </w:r>
     </w:p>
     <w:p>
@@ -1881,23 +2455,97 @@
         <w:pStyle w:val="Listenabsatz"/>
         <w:numPr>
           <w:ilvl w:val="0"/>
-          <w:numId w:val="23"/>
+          <w:numId w:val="28"/>
         </w:numPr>
-      </w:pPr>
+        <w:tabs>
+          <w:tab w:val="clear" w:pos="1134"/>
+          <w:tab w:val="clear" w:pos="2268"/>
+        </w:tabs>
+        <w:spacing w:before="100" w:beforeAutospacing="1" w:after="100" w:afterAutospacing="1" w:line="240" w:lineRule="auto"/>
+        <w:rPr>
+          <w:rFonts w:ascii="Times New Roman" w:hAnsi="Times New Roman"/>
+          <w:color w:val="000000"/>
+          <w:sz w:val="24"/>
+          <w:szCs w:val="24"/>
+        </w:rPr>
+      </w:pPr>
+      <w:r>
+        <w:rPr>
+          <w:rFonts w:ascii="Times New Roman" w:hAnsi="Times New Roman"/>
+          <w:color w:val="000000"/>
+          <w:sz w:val="24"/>
+          <w:szCs w:val="24"/>
+        </w:rPr>
+        <w:t>Das Auto soll sich dynamisch zwischen den Spuren bewegen können.</w:t>
+      </w:r>
     </w:p>
     <w:p>
       <w:pPr>
         <w:pStyle w:val="Listenabsatz"/>
         <w:numPr>
           <w:ilvl w:val="0"/>
-          <w:numId w:val="22"/>
+          <w:numId w:val="29"/>
         </w:numPr>
-      </w:pPr>
-      <w:r>
-        <w:t xml:space="preserve">Das Auto soll </w:t>
-      </w:r>
-      <w:r>
-        <w:t>sich Dynamisch zwischen den Spuren bewegen können</w:t>
+        <w:tabs>
+          <w:tab w:val="clear" w:pos="1134"/>
+          <w:tab w:val="clear" w:pos="2268"/>
+        </w:tabs>
+        <w:spacing w:before="100" w:beforeAutospacing="1" w:after="100" w:afterAutospacing="1" w:line="240" w:lineRule="auto"/>
+        <w:rPr>
+          <w:rFonts w:ascii="Times New Roman" w:hAnsi="Times New Roman"/>
+          <w:color w:val="000000"/>
+          <w:sz w:val="24"/>
+          <w:szCs w:val="24"/>
+        </w:rPr>
+      </w:pPr>
+      <w:r>
+        <w:rPr>
+          <w:rFonts w:ascii="Times New Roman" w:hAnsi="Times New Roman"/>
+          <w:color w:val="000000"/>
+          <w:sz w:val="24"/>
+          <w:szCs w:val="24"/>
+        </w:rPr>
+        <w:t xml:space="preserve">Nach </w:t>
+      </w:r>
+      <w:proofErr w:type="gramStart"/>
+      <w:r>
+        <w:rPr>
+          <w:rFonts w:ascii="Times New Roman" w:hAnsi="Times New Roman"/>
+          <w:color w:val="000000"/>
+          <w:sz w:val="24"/>
+          <w:szCs w:val="24"/>
+        </w:rPr>
+        <w:t>Vorne</w:t>
+      </w:r>
+      <w:proofErr w:type="gramEnd"/>
+      <w:r>
+        <w:rPr>
+          <w:rFonts w:ascii="Times New Roman" w:hAnsi="Times New Roman"/>
+          <w:color w:val="000000"/>
+          <w:sz w:val="24"/>
+          <w:szCs w:val="24"/>
+        </w:rPr>
+        <w:t xml:space="preserve">/ </w:t>
+      </w:r>
+      <w:proofErr w:type="gramStart"/>
+      <w:r>
+        <w:rPr>
+          <w:rFonts w:ascii="Times New Roman" w:hAnsi="Times New Roman"/>
+          <w:color w:val="000000"/>
+          <w:sz w:val="24"/>
+          <w:szCs w:val="24"/>
+        </w:rPr>
+        <w:t>Hinten</w:t>
+      </w:r>
+      <w:proofErr w:type="gramEnd"/>
+      <w:r>
+        <w:rPr>
+          <w:rFonts w:ascii="Times New Roman" w:hAnsi="Times New Roman"/>
+          <w:color w:val="000000"/>
+          <w:sz w:val="24"/>
+          <w:szCs w:val="24"/>
+        </w:rPr>
+        <w:t>/ Rechts/ Links</w:t>
       </w:r>
     </w:p>
     <w:p>
@@ -1905,27 +2553,28 @@
         <w:pStyle w:val="Listenabsatz"/>
         <w:numPr>
           <w:ilvl w:val="0"/>
-          <w:numId w:val="23"/>
+          <w:numId w:val="28"/>
         </w:numPr>
-      </w:pPr>
-      <w:r>
-        <w:t xml:space="preserve">Nach </w:t>
-      </w:r>
-      <w:proofErr w:type="gramStart"/>
-      <w:r>
-        <w:t>Vorne</w:t>
-      </w:r>
-      <w:proofErr w:type="gramEnd"/>
-      <w:r>
-        <w:t xml:space="preserve">/ </w:t>
-      </w:r>
-      <w:proofErr w:type="gramStart"/>
-      <w:r>
-        <w:t>Hinten</w:t>
-      </w:r>
-      <w:proofErr w:type="gramEnd"/>
-      <w:r>
-        <w:t>/ Rechts/ Links</w:t>
+        <w:tabs>
+          <w:tab w:val="clear" w:pos="1134"/>
+          <w:tab w:val="clear" w:pos="2268"/>
+        </w:tabs>
+        <w:spacing w:before="100" w:beforeAutospacing="1" w:after="100" w:afterAutospacing="1" w:line="240" w:lineRule="auto"/>
+        <w:rPr>
+          <w:rFonts w:ascii="Times New Roman" w:hAnsi="Times New Roman"/>
+          <w:color w:val="000000"/>
+          <w:sz w:val="24"/>
+          <w:szCs w:val="24"/>
+        </w:rPr>
+      </w:pPr>
+      <w:r>
+        <w:rPr>
+          <w:rFonts w:ascii="Times New Roman" w:hAnsi="Times New Roman"/>
+          <w:color w:val="000000"/>
+          <w:sz w:val="24"/>
+          <w:szCs w:val="24"/>
+        </w:rPr>
+        <w:t>Die Hindernisse (Autos) sollen fest in ihren Spuren sein</w:t>
       </w:r>
     </w:p>
     <w:p>
@@ -1933,11 +2582,28 @@
         <w:pStyle w:val="Listenabsatz"/>
         <w:numPr>
           <w:ilvl w:val="0"/>
-          <w:numId w:val="22"/>
+          <w:numId w:val="29"/>
         </w:numPr>
-      </w:pPr>
-      <w:r>
-        <w:t>Die Hindernisse (Autos) sollen fest in ihren Spuren sein</w:t>
+        <w:tabs>
+          <w:tab w:val="clear" w:pos="1134"/>
+          <w:tab w:val="clear" w:pos="2268"/>
+        </w:tabs>
+        <w:spacing w:before="100" w:beforeAutospacing="1" w:after="100" w:afterAutospacing="1" w:line="240" w:lineRule="auto"/>
+        <w:rPr>
+          <w:rFonts w:ascii="Times New Roman" w:hAnsi="Times New Roman"/>
+          <w:color w:val="000000"/>
+          <w:sz w:val="24"/>
+          <w:szCs w:val="24"/>
+        </w:rPr>
+      </w:pPr>
+      <w:r>
+        <w:rPr>
+          <w:rFonts w:ascii="Times New Roman" w:hAnsi="Times New Roman"/>
+          <w:color w:val="000000"/>
+          <w:sz w:val="24"/>
+          <w:szCs w:val="24"/>
+        </w:rPr>
+        <w:t>Wechsel zwischen Fahrzeuggrößen (Abzug unterschiedliche Leben)</w:t>
       </w:r>
     </w:p>
     <w:p>
@@ -1945,19 +2611,28 @@
         <w:pStyle w:val="Listenabsatz"/>
         <w:numPr>
           <w:ilvl w:val="0"/>
-          <w:numId w:val="23"/>
+          <w:numId w:val="29"/>
         </w:numPr>
-      </w:pPr>
-      <w:r>
-        <w:t xml:space="preserve">Wechsel zwischen </w:t>
-      </w:r>
-      <w:proofErr w:type="spellStart"/>
-      <w:r>
-        <w:t>Fahrzeuggrössen</w:t>
-      </w:r>
-      <w:proofErr w:type="spellEnd"/>
-      <w:r>
-        <w:t xml:space="preserve"> (Abzug unterschiedliche Leben)</w:t>
+        <w:tabs>
+          <w:tab w:val="clear" w:pos="1134"/>
+          <w:tab w:val="clear" w:pos="2268"/>
+        </w:tabs>
+        <w:spacing w:before="100" w:beforeAutospacing="1" w:after="100" w:afterAutospacing="1" w:line="240" w:lineRule="auto"/>
+        <w:rPr>
+          <w:rFonts w:ascii="Times New Roman" w:hAnsi="Times New Roman"/>
+          <w:color w:val="000000"/>
+          <w:sz w:val="24"/>
+          <w:szCs w:val="24"/>
+        </w:rPr>
+      </w:pPr>
+      <w:r>
+        <w:rPr>
+          <w:rFonts w:ascii="Times New Roman" w:hAnsi="Times New Roman"/>
+          <w:color w:val="000000"/>
+          <w:sz w:val="24"/>
+          <w:szCs w:val="24"/>
+        </w:rPr>
+        <w:t>Autos wechseln nach gewisser Zeit auch die Spuren.</w:t>
       </w:r>
     </w:p>
     <w:p>
@@ -1965,19 +2640,39 @@
         <w:pStyle w:val="Listenabsatz"/>
         <w:numPr>
           <w:ilvl w:val="0"/>
-          <w:numId w:val="23"/>
+          <w:numId w:val="29"/>
         </w:numPr>
-      </w:pPr>
-      <w:r>
-        <w:t xml:space="preserve">Autos wechseln nach gewisser Zeit auch </w:t>
-      </w:r>
-      <w:proofErr w:type="spellStart"/>
-      <w:r>
-        <w:t>auch</w:t>
-      </w:r>
-      <w:proofErr w:type="spellEnd"/>
-      <w:r>
-        <w:t xml:space="preserve"> die Spuren</w:t>
+        <w:tabs>
+          <w:tab w:val="clear" w:pos="1134"/>
+          <w:tab w:val="clear" w:pos="2268"/>
+        </w:tabs>
+        <w:spacing w:before="100" w:beforeAutospacing="1" w:after="100" w:afterAutospacing="1" w:line="240" w:lineRule="auto"/>
+        <w:rPr>
+          <w:rFonts w:ascii="Times New Roman" w:hAnsi="Times New Roman"/>
+          <w:color w:val="000000"/>
+          <w:sz w:val="24"/>
+          <w:szCs w:val="24"/>
+        </w:rPr>
+      </w:pPr>
+      <w:proofErr w:type="gramStart"/>
+      <w:r>
+        <w:rPr>
+          <w:rFonts w:ascii="Times New Roman" w:hAnsi="Times New Roman"/>
+          <w:color w:val="000000"/>
+          <w:sz w:val="24"/>
+          <w:szCs w:val="24"/>
+        </w:rPr>
+        <w:t>Polizei</w:t>
+      </w:r>
+      <w:proofErr w:type="gramEnd"/>
+      <w:r>
+        <w:rPr>
+          <w:rFonts w:ascii="Times New Roman" w:hAnsi="Times New Roman"/>
+          <w:color w:val="000000"/>
+          <w:sz w:val="24"/>
+          <w:szCs w:val="24"/>
+        </w:rPr>
+        <w:t xml:space="preserve"> die durch das Spielfeld kommt, und wenn erwischt, Spiel vorbei</w:t>
       </w:r>
     </w:p>
     <w:p>
@@ -1985,16 +2680,39 @@
         <w:pStyle w:val="Listenabsatz"/>
         <w:numPr>
           <w:ilvl w:val="0"/>
-          <w:numId w:val="23"/>
+          <w:numId w:val="28"/>
         </w:numPr>
-      </w:pPr>
-      <w:proofErr w:type="gramStart"/>
-      <w:r>
-        <w:t>Polizei</w:t>
-      </w:r>
-      <w:proofErr w:type="gramEnd"/>
-      <w:r>
-        <w:t xml:space="preserve"> die durch das Spielfeld kommt und wenn erwischt spiel vorbei</w:t>
+        <w:tabs>
+          <w:tab w:val="clear" w:pos="1134"/>
+          <w:tab w:val="clear" w:pos="2268"/>
+        </w:tabs>
+        <w:spacing w:before="100" w:beforeAutospacing="1" w:after="100" w:afterAutospacing="1" w:line="240" w:lineRule="auto"/>
+        <w:rPr>
+          <w:rFonts w:ascii="Times New Roman" w:hAnsi="Times New Roman"/>
+          <w:color w:val="000000"/>
+          <w:sz w:val="24"/>
+          <w:szCs w:val="24"/>
+        </w:rPr>
+      </w:pPr>
+      <w:proofErr w:type="spellStart"/>
+      <w:r>
+        <w:rPr>
+          <w:rFonts w:ascii="Times New Roman" w:hAnsi="Times New Roman"/>
+          <w:color w:val="000000"/>
+          <w:sz w:val="24"/>
+          <w:szCs w:val="24"/>
+        </w:rPr>
+        <w:t>Speedboost</w:t>
+      </w:r>
+      <w:proofErr w:type="spellEnd"/>
+      <w:r>
+        <w:rPr>
+          <w:rFonts w:ascii="Times New Roman" w:hAnsi="Times New Roman"/>
+          <w:color w:val="000000"/>
+          <w:sz w:val="24"/>
+          <w:szCs w:val="24"/>
+        </w:rPr>
+        <w:t xml:space="preserve"> über Tastenkombination</w:t>
       </w:r>
     </w:p>
     <w:p>
@@ -2002,16 +2720,28 @@
         <w:pStyle w:val="Listenabsatz"/>
         <w:numPr>
           <w:ilvl w:val="0"/>
-          <w:numId w:val="22"/>
+          <w:numId w:val="28"/>
         </w:numPr>
-      </w:pPr>
-      <w:proofErr w:type="spellStart"/>
-      <w:r>
-        <w:t>Speedboost</w:t>
-      </w:r>
-      <w:proofErr w:type="spellEnd"/>
-      <w:r>
-        <w:t xml:space="preserve"> über Tastenkombination</w:t>
+        <w:tabs>
+          <w:tab w:val="clear" w:pos="1134"/>
+          <w:tab w:val="clear" w:pos="2268"/>
+        </w:tabs>
+        <w:spacing w:before="100" w:beforeAutospacing="1" w:after="100" w:afterAutospacing="1" w:line="240" w:lineRule="auto"/>
+        <w:rPr>
+          <w:rFonts w:ascii="Times New Roman" w:hAnsi="Times New Roman"/>
+          <w:color w:val="000000"/>
+          <w:sz w:val="24"/>
+          <w:szCs w:val="24"/>
+        </w:rPr>
+      </w:pPr>
+      <w:r>
+        <w:rPr>
+          <w:rFonts w:ascii="Times New Roman" w:hAnsi="Times New Roman"/>
+          <w:color w:val="000000"/>
+          <w:sz w:val="24"/>
+          <w:szCs w:val="24"/>
+        </w:rPr>
+        <w:t>Items (werden gepickt und verwendet)</w:t>
       </w:r>
     </w:p>
     <w:p>
@@ -2019,14 +2749,28 @@
         <w:pStyle w:val="Listenabsatz"/>
         <w:numPr>
           <w:ilvl w:val="0"/>
-          <w:numId w:val="22"/>
+          <w:numId w:val="29"/>
         </w:numPr>
-      </w:pPr>
-      <w:r>
-        <w:t>Items</w:t>
-      </w:r>
-      <w:r>
-        <w:t xml:space="preserve"> (werden gepickt und verwendet)</w:t>
+        <w:tabs>
+          <w:tab w:val="clear" w:pos="1134"/>
+          <w:tab w:val="clear" w:pos="2268"/>
+        </w:tabs>
+        <w:spacing w:before="100" w:beforeAutospacing="1" w:after="100" w:afterAutospacing="1" w:line="240" w:lineRule="auto"/>
+        <w:rPr>
+          <w:rFonts w:ascii="Times New Roman" w:hAnsi="Times New Roman"/>
+          <w:color w:val="000000"/>
+          <w:sz w:val="24"/>
+          <w:szCs w:val="24"/>
+        </w:rPr>
+      </w:pPr>
+      <w:r>
+        <w:rPr>
+          <w:rFonts w:ascii="Times New Roman" w:hAnsi="Times New Roman"/>
+          <w:color w:val="000000"/>
+          <w:sz w:val="24"/>
+          <w:szCs w:val="24"/>
+        </w:rPr>
+        <w:t>Vodka (Alkohol): Vertauschen der Pfeiltasten für paar Sekunden</w:t>
       </w:r>
     </w:p>
     <w:p>
@@ -2034,36 +2778,77 @@
         <w:pStyle w:val="Listenabsatz"/>
         <w:numPr>
           <w:ilvl w:val="0"/>
-          <w:numId w:val="23"/>
+          <w:numId w:val="29"/>
         </w:numPr>
-      </w:pPr>
-      <w:r>
-        <w:t xml:space="preserve">Vodka (Alkohol) Vertauschen der Pfeiltasten für paar </w:t>
+        <w:tabs>
+          <w:tab w:val="clear" w:pos="1134"/>
+          <w:tab w:val="clear" w:pos="2268"/>
+        </w:tabs>
+        <w:spacing w:before="100" w:beforeAutospacing="1" w:after="100" w:afterAutospacing="1" w:line="240" w:lineRule="auto"/>
+        <w:rPr>
+          <w:rFonts w:ascii="Times New Roman" w:hAnsi="Times New Roman"/>
+          <w:color w:val="000000"/>
+          <w:sz w:val="24"/>
+          <w:szCs w:val="24"/>
+        </w:rPr>
+      </w:pPr>
+      <w:r>
+        <w:rPr>
+          <w:rFonts w:ascii="Times New Roman" w:hAnsi="Times New Roman"/>
+          <w:color w:val="000000"/>
+          <w:sz w:val="24"/>
+          <w:szCs w:val="24"/>
+        </w:rPr>
+        <w:t>Stern (</w:t>
       </w:r>
       <w:proofErr w:type="spellStart"/>
       <w:r>
-        <w:t>sekunden</w:t>
+        <w:rPr>
+          <w:rFonts w:ascii="Times New Roman" w:hAnsi="Times New Roman"/>
+          <w:color w:val="000000"/>
+          <w:sz w:val="24"/>
+          <w:szCs w:val="24"/>
+        </w:rPr>
+        <w:t>Mariokart</w:t>
       </w:r>
       <w:proofErr w:type="spellEnd"/>
+      <w:r>
+        <w:rPr>
+          <w:rFonts w:ascii="Times New Roman" w:hAnsi="Times New Roman"/>
+          <w:color w:val="000000"/>
+          <w:sz w:val="24"/>
+          <w:szCs w:val="24"/>
+        </w:rPr>
+        <w:t>): Immunität</w:t>
+      </w:r>
     </w:p>
     <w:p>
       <w:pPr>
         <w:pStyle w:val="Listenabsatz"/>
         <w:numPr>
           <w:ilvl w:val="0"/>
-          <w:numId w:val="23"/>
+          <w:numId w:val="29"/>
         </w:numPr>
-      </w:pPr>
-      <w:r>
-        <w:t>Stern (</w:t>
-      </w:r>
-      <w:proofErr w:type="spellStart"/>
-      <w:r>
-        <w:t>Mariokart</w:t>
-      </w:r>
-      <w:proofErr w:type="spellEnd"/>
-      <w:r>
-        <w:t>) Immunität</w:t>
+        <w:tabs>
+          <w:tab w:val="clear" w:pos="1134"/>
+          <w:tab w:val="clear" w:pos="2268"/>
+        </w:tabs>
+        <w:spacing w:before="100" w:beforeAutospacing="1" w:after="100" w:afterAutospacing="1" w:line="240" w:lineRule="auto"/>
+        <w:rPr>
+          <w:rFonts w:ascii="Times New Roman" w:hAnsi="Times New Roman"/>
+          <w:color w:val="000000"/>
+          <w:sz w:val="24"/>
+          <w:szCs w:val="24"/>
+        </w:rPr>
+      </w:pPr>
+      <w:r>
+        <w:rPr>
+          <w:rFonts w:ascii="Times New Roman" w:hAnsi="Times New Roman"/>
+          <w:color w:val="000000"/>
+          <w:sz w:val="24"/>
+          <w:szCs w:val="24"/>
+        </w:rPr>
+        <w:t>Uhr (Sanduhr): Zeitlupe für paar Sekunden</w:t>
       </w:r>
     </w:p>
     <w:p>
@@ -2071,41 +2856,108 @@
         <w:pStyle w:val="Listenabsatz"/>
         <w:numPr>
           <w:ilvl w:val="0"/>
-          <w:numId w:val="23"/>
+          <w:numId w:val="29"/>
         </w:numPr>
-      </w:pPr>
-      <w:r>
-        <w:t xml:space="preserve">Uhr (Sanduhr) Zeitlupe für paar </w:t>
+        <w:tabs>
+          <w:tab w:val="clear" w:pos="1134"/>
+          <w:tab w:val="clear" w:pos="2268"/>
+        </w:tabs>
+        <w:spacing w:before="100" w:beforeAutospacing="1" w:after="100" w:afterAutospacing="1" w:line="240" w:lineRule="auto"/>
+        <w:rPr>
+          <w:rFonts w:ascii="Times New Roman" w:hAnsi="Times New Roman"/>
+          <w:color w:val="000000"/>
+          <w:sz w:val="24"/>
+          <w:szCs w:val="24"/>
+        </w:rPr>
+      </w:pPr>
+      <w:proofErr w:type="gramStart"/>
+      <w:r>
+        <w:rPr>
+          <w:rFonts w:ascii="Times New Roman" w:hAnsi="Times New Roman"/>
+          <w:color w:val="000000"/>
+          <w:sz w:val="24"/>
+          <w:szCs w:val="24"/>
+        </w:rPr>
+        <w:t>Extra Leben</w:t>
+      </w:r>
+      <w:proofErr w:type="gramEnd"/>
+      <w:r>
+        <w:rPr>
+          <w:rFonts w:ascii="Times New Roman" w:hAnsi="Times New Roman"/>
+          <w:color w:val="000000"/>
+          <w:sz w:val="24"/>
+          <w:szCs w:val="24"/>
+        </w:rPr>
+        <w:t xml:space="preserve"> (</w:t>
       </w:r>
       <w:proofErr w:type="spellStart"/>
       <w:r>
-        <w:t>sekunden</w:t>
+        <w:rPr>
+          <w:rFonts w:ascii="Times New Roman" w:hAnsi="Times New Roman"/>
+          <w:color w:val="000000"/>
+          <w:sz w:val="24"/>
+          <w:szCs w:val="24"/>
+        </w:rPr>
+        <w:t>Werkzeigkasten</w:t>
       </w:r>
       <w:proofErr w:type="spellEnd"/>
+      <w:r>
+        <w:rPr>
+          <w:rFonts w:ascii="Times New Roman" w:hAnsi="Times New Roman"/>
+          <w:color w:val="000000"/>
+          <w:sz w:val="24"/>
+          <w:szCs w:val="24"/>
+        </w:rPr>
+        <w:t>)</w:t>
+      </w:r>
     </w:p>
     <w:p>
       <w:pPr>
         <w:pStyle w:val="Listenabsatz"/>
         <w:numPr>
           <w:ilvl w:val="0"/>
-          <w:numId w:val="23"/>
+          <w:numId w:val="28"/>
         </w:numPr>
-      </w:pPr>
+        <w:tabs>
+          <w:tab w:val="clear" w:pos="1134"/>
+          <w:tab w:val="clear" w:pos="2268"/>
+        </w:tabs>
+        <w:spacing w:before="100" w:beforeAutospacing="1" w:after="100" w:afterAutospacing="1" w:line="240" w:lineRule="auto"/>
+        <w:rPr>
+          <w:rFonts w:ascii="Times New Roman" w:hAnsi="Times New Roman"/>
+          <w:color w:val="000000"/>
+          <w:sz w:val="24"/>
+          <w:szCs w:val="24"/>
+        </w:rPr>
+      </w:pPr>
+      <w:r>
+        <w:rPr>
+          <w:rFonts w:ascii="Times New Roman" w:hAnsi="Times New Roman"/>
+          <w:color w:val="000000"/>
+          <w:sz w:val="24"/>
+          <w:szCs w:val="24"/>
+        </w:rPr>
+        <w:t xml:space="preserve">Brücke </w:t>
+      </w:r>
       <w:proofErr w:type="gramStart"/>
       <w:r>
-        <w:t>Extra Leben</w:t>
+        <w:rPr>
+          <w:rFonts w:ascii="Times New Roman" w:hAnsi="Times New Roman"/>
+          <w:color w:val="000000"/>
+          <w:sz w:val="24"/>
+          <w:szCs w:val="24"/>
+        </w:rPr>
+        <w:t>die Teil</w:t>
       </w:r>
       <w:proofErr w:type="gramEnd"/>
       <w:r>
-        <w:t xml:space="preserve"> (</w:t>
-      </w:r>
-      <w:proofErr w:type="spellStart"/>
-      <w:r>
-        <w:t>Werkzeigkasten</w:t>
-      </w:r>
-      <w:proofErr w:type="spellEnd"/>
-      <w:r>
-        <w:t>)</w:t>
+        <w:rPr>
+          <w:rFonts w:ascii="Times New Roman" w:hAnsi="Times New Roman"/>
+          <w:color w:val="000000"/>
+          <w:sz w:val="24"/>
+          <w:szCs w:val="24"/>
+        </w:rPr>
+        <w:t xml:space="preserve"> des Spielfeldes verdeckt, und dadurch sieht man die Autos nicht.</w:t>
       </w:r>
     </w:p>
     <w:p>
@@ -2113,19 +2965,28 @@
         <w:pStyle w:val="Listenabsatz"/>
         <w:numPr>
           <w:ilvl w:val="0"/>
-          <w:numId w:val="22"/>
+          <w:numId w:val="28"/>
         </w:numPr>
-      </w:pPr>
-      <w:r>
-        <w:t xml:space="preserve">Brücke </w:t>
-      </w:r>
-      <w:proofErr w:type="gramStart"/>
-      <w:r>
-        <w:t>die Teil</w:t>
-      </w:r>
-      <w:proofErr w:type="gramEnd"/>
-      <w:r>
-        <w:t xml:space="preserve"> des Spielfeldes verdeckt und dadurch man die Autos nicht sieht</w:t>
+        <w:tabs>
+          <w:tab w:val="clear" w:pos="1134"/>
+          <w:tab w:val="clear" w:pos="2268"/>
+        </w:tabs>
+        <w:spacing w:before="100" w:beforeAutospacing="1" w:after="100" w:afterAutospacing="1" w:line="240" w:lineRule="auto"/>
+        <w:rPr>
+          <w:rFonts w:ascii="Times New Roman" w:hAnsi="Times New Roman"/>
+          <w:color w:val="000000"/>
+          <w:sz w:val="24"/>
+          <w:szCs w:val="24"/>
+        </w:rPr>
+      </w:pPr>
+      <w:r>
+        <w:rPr>
+          <w:rFonts w:ascii="Times New Roman" w:hAnsi="Times New Roman"/>
+          <w:color w:val="000000"/>
+          <w:sz w:val="24"/>
+          <w:szCs w:val="24"/>
+        </w:rPr>
+        <w:t>Nach gewisser Zeit kommt die Polizei dir auf die Schliche. </w:t>
       </w:r>
     </w:p>
     <w:p>
@@ -2133,54 +2994,83 @@
         <w:pStyle w:val="Listenabsatz"/>
         <w:numPr>
           <w:ilvl w:val="0"/>
-          <w:numId w:val="22"/>
+          <w:numId w:val="29"/>
         </w:numPr>
-      </w:pPr>
-      <w:r>
-        <w:t xml:space="preserve">Nach gewisser Zeit Polizei kommt dir auf die Schliche </w:t>
-      </w:r>
-    </w:p>
-    <w:p>
-      <w:pPr>
-        <w:pStyle w:val="Listenabsatz"/>
-        <w:numPr>
-          <w:ilvl w:val="0"/>
-          <w:numId w:val="23"/>
-        </w:numPr>
-      </w:pPr>
-      <w:r>
-        <w:t xml:space="preserve">Verkehr dreht sich und du fährst mit doppelter </w:t>
-      </w:r>
-      <w:proofErr w:type="spellStart"/>
-      <w:r>
-        <w:t>geschwindigkeit</w:t>
-      </w:r>
-      <w:proofErr w:type="spellEnd"/>
-      <w:r>
-        <w:t xml:space="preserve"> mit Verkehr</w:t>
-      </w:r>
-    </w:p>
-    <w:p>
-      <w:pPr>
-        <w:pStyle w:val="Listenabsatz"/>
-      </w:pPr>
-    </w:p>
-    <w:p>
-      <w:pPr>
-        <w:pStyle w:val="Listenabsatz"/>
-      </w:pPr>
-    </w:p>
-    <w:p>
-      <w:pPr>
-        <w:pStyle w:val="Listenabsatz"/>
-      </w:pPr>
+        <w:tabs>
+          <w:tab w:val="clear" w:pos="1134"/>
+          <w:tab w:val="clear" w:pos="2268"/>
+        </w:tabs>
+        <w:spacing w:before="100" w:beforeAutospacing="1" w:after="100" w:afterAutospacing="1" w:line="240" w:lineRule="auto"/>
+        <w:rPr>
+          <w:rFonts w:ascii="Times New Roman" w:hAnsi="Times New Roman"/>
+          <w:color w:val="000000"/>
+          <w:sz w:val="24"/>
+          <w:szCs w:val="24"/>
+        </w:rPr>
+      </w:pPr>
+      <w:r>
+        <w:rPr>
+          <w:rFonts w:ascii="Times New Roman" w:hAnsi="Times New Roman"/>
+          <w:color w:val="000000"/>
+          <w:sz w:val="24"/>
+          <w:szCs w:val="24"/>
+        </w:rPr>
+        <w:t>Verkehr dreht sich und du fährst mit doppelter Geschwindigkeit mit Verkehr</w:t>
+      </w:r>
+    </w:p>
+    <w:p>
+      <w:pPr>
+        <w:tabs>
+          <w:tab w:val="clear" w:pos="1134"/>
+          <w:tab w:val="clear" w:pos="2268"/>
+        </w:tabs>
+        <w:spacing w:line="240" w:lineRule="auto"/>
+        <w:rPr>
+          <w:rFonts w:ascii="Times New Roman" w:hAnsi="Times New Roman"/>
+          <w:color w:val="000000"/>
+          <w:szCs w:val="22"/>
+        </w:rPr>
+      </w:pPr>
+    </w:p>
+    <w:p>
+      <w:pPr>
+        <w:rPr>
+          <w:rFonts w:ascii="Times New Roman" w:hAnsi="Times New Roman"/>
+        </w:rPr>
+      </w:pPr>
+      <w:r>
+        <w:rPr>
+          <w:rFonts w:ascii="Times New Roman" w:hAnsi="Times New Roman"/>
+          <w:highlight w:val="yellow"/>
+        </w:rPr>
+        <w:t>Nutzwertanalyse</w:t>
+      </w:r>
+    </w:p>
+    <w:p>
+      <w:pPr>
+        <w:tabs>
+          <w:tab w:val="clear" w:pos="1134"/>
+          <w:tab w:val="clear" w:pos="2268"/>
+        </w:tabs>
+        <w:spacing w:after="160" w:line="259" w:lineRule="auto"/>
+        <w:rPr>
+          <w:rFonts w:ascii="Times New Roman" w:hAnsi="Times New Roman"/>
+        </w:rPr>
+      </w:pPr>
+      <w:r>
+        <w:rPr>
+          <w:rFonts w:ascii="Times New Roman" w:hAnsi="Times New Roman"/>
+        </w:rPr>
+        <w:br w:type="page"/>
+      </w:r>
     </w:p>
     <w:p>
       <w:pPr>
         <w:pStyle w:val="berschrift1"/>
       </w:pPr>
       <w:r>
-        <w:t>Umsetzung</w:t>
+        <w:lastRenderedPageBreak/>
+        <w:t xml:space="preserve">Umsetzung und Implementierung </w:t>
       </w:r>
     </w:p>
     <w:p>
@@ -2221,32 +3111,23 @@
       <w:r>
         <w:t xml:space="preserve">Funktionen des </w:t>
       </w:r>
-      <w:proofErr w:type="spellStart"/>
-      <w:r>
-        <w:t>screens</w:t>
-      </w:r>
-      <w:proofErr w:type="spellEnd"/>
-      <w:r>
-        <w:t xml:space="preserve"> </w:t>
-      </w:r>
-      <w:r>
-        <w:t xml:space="preserve">(Musik-Auswahl, Scoreboard, Anleitung mit Storyline, Skin Auswahl, Start, Randparameter </w:t>
-      </w:r>
-      <w:proofErr w:type="spellStart"/>
-      <w:r>
-        <w:t>wahl</w:t>
-      </w:r>
-      <w:proofErr w:type="spellEnd"/>
-      <w:r>
-        <w:t xml:space="preserve"> (wieviel </w:t>
-      </w:r>
-      <w:proofErr w:type="spellStart"/>
-      <w:r>
-        <w:t>autos</w:t>
-      </w:r>
-      <w:proofErr w:type="spellEnd"/>
-      <w:r>
-        <w:t>, wie schnell,</w:t>
+      <w:r>
+        <w:t>S</w:t>
+      </w:r>
+      <w:r>
+        <w:t xml:space="preserve">creens (Musik-Auswahl, Scoreboard, Anleitung mit Storyline, Skin Auswahl, Start, Randparameter </w:t>
+      </w:r>
+      <w:r>
+        <w:t>W</w:t>
+      </w:r>
+      <w:r>
+        <w:t xml:space="preserve">ahl (wieviel </w:t>
+      </w:r>
+      <w:r>
+        <w:t>A</w:t>
+      </w:r>
+      <w:r>
+        <w:t>utos, wie schnell,</w:t>
       </w:r>
       <w:proofErr w:type="gramStart"/>
       <w:r>
@@ -2275,7 +3156,6 @@
         </w:numPr>
       </w:pPr>
       <w:r>
-        <w:lastRenderedPageBreak/>
         <w:t>Brücke mit Polizei</w:t>
       </w:r>
     </w:p>
@@ -3610,6 +4490,95 @@
     </w:lvl>
   </w:abstractNum>
   <w:abstractNum w:abstractNumId="10" w15:restartNumberingAfterBreak="0">
+    <w:nsid w:val="23C327DE"/>
+    <w:multiLevelType w:val="hybridMultilevel"/>
+    <w:tmpl w:val="74F2E5FA"/>
+    <w:lvl w:ilvl="0" w:tplc="0407000F">
+      <w:start w:val="1"/>
+      <w:numFmt w:val="decimal"/>
+      <w:lvlText w:val="%1."/>
+      <w:lvlJc w:val="left"/>
+      <w:pPr>
+        <w:ind w:left="720" w:hanging="360"/>
+      </w:pPr>
+      <w:rPr>
+        <w:rFonts w:hint="default"/>
+      </w:rPr>
+    </w:lvl>
+    <w:lvl w:ilvl="1" w:tplc="04070019" w:tentative="1">
+      <w:start w:val="1"/>
+      <w:numFmt w:val="lowerLetter"/>
+      <w:lvlText w:val="%2."/>
+      <w:lvlJc w:val="left"/>
+      <w:pPr>
+        <w:ind w:left="1440" w:hanging="360"/>
+      </w:pPr>
+    </w:lvl>
+    <w:lvl w:ilvl="2" w:tplc="0407001B" w:tentative="1">
+      <w:start w:val="1"/>
+      <w:numFmt w:val="lowerRoman"/>
+      <w:lvlText w:val="%3."/>
+      <w:lvlJc w:val="right"/>
+      <w:pPr>
+        <w:ind w:left="2160" w:hanging="180"/>
+      </w:pPr>
+    </w:lvl>
+    <w:lvl w:ilvl="3" w:tplc="0407000F" w:tentative="1">
+      <w:start w:val="1"/>
+      <w:numFmt w:val="decimal"/>
+      <w:lvlText w:val="%4."/>
+      <w:lvlJc w:val="left"/>
+      <w:pPr>
+        <w:ind w:left="2880" w:hanging="360"/>
+      </w:pPr>
+    </w:lvl>
+    <w:lvl w:ilvl="4" w:tplc="04070019" w:tentative="1">
+      <w:start w:val="1"/>
+      <w:numFmt w:val="lowerLetter"/>
+      <w:lvlText w:val="%5."/>
+      <w:lvlJc w:val="left"/>
+      <w:pPr>
+        <w:ind w:left="3600" w:hanging="360"/>
+      </w:pPr>
+    </w:lvl>
+    <w:lvl w:ilvl="5" w:tplc="0407001B" w:tentative="1">
+      <w:start w:val="1"/>
+      <w:numFmt w:val="lowerRoman"/>
+      <w:lvlText w:val="%6."/>
+      <w:lvlJc w:val="right"/>
+      <w:pPr>
+        <w:ind w:left="4320" w:hanging="180"/>
+      </w:pPr>
+    </w:lvl>
+    <w:lvl w:ilvl="6" w:tplc="0407000F" w:tentative="1">
+      <w:start w:val="1"/>
+      <w:numFmt w:val="decimal"/>
+      <w:lvlText w:val="%7."/>
+      <w:lvlJc w:val="left"/>
+      <w:pPr>
+        <w:ind w:left="5040" w:hanging="360"/>
+      </w:pPr>
+    </w:lvl>
+    <w:lvl w:ilvl="7" w:tplc="04070019" w:tentative="1">
+      <w:start w:val="1"/>
+      <w:numFmt w:val="lowerLetter"/>
+      <w:lvlText w:val="%8."/>
+      <w:lvlJc w:val="left"/>
+      <w:pPr>
+        <w:ind w:left="5760" w:hanging="360"/>
+      </w:pPr>
+    </w:lvl>
+    <w:lvl w:ilvl="8" w:tplc="0407001B" w:tentative="1">
+      <w:start w:val="1"/>
+      <w:numFmt w:val="lowerRoman"/>
+      <w:lvlText w:val="%9."/>
+      <w:lvlJc w:val="right"/>
+      <w:pPr>
+        <w:ind w:left="6480" w:hanging="180"/>
+      </w:pPr>
+    </w:lvl>
+  </w:abstractNum>
+  <w:abstractNum w:abstractNumId="11" w15:restartNumberingAfterBreak="0">
     <w:nsid w:val="25D1790B"/>
     <w:multiLevelType w:val="hybridMultilevel"/>
     <w:tmpl w:val="39F6EBB4"/>
@@ -3698,7 +4667,7 @@
       </w:pPr>
     </w:lvl>
   </w:abstractNum>
-  <w:abstractNum w:abstractNumId="11" w15:restartNumberingAfterBreak="0">
+  <w:abstractNum w:abstractNumId="12" w15:restartNumberingAfterBreak="0">
     <w:nsid w:val="275F1198"/>
     <w:multiLevelType w:val="hybridMultilevel"/>
     <w:tmpl w:val="C00E5C24"/>
@@ -3811,7 +4780,7 @@
       </w:rPr>
     </w:lvl>
   </w:abstractNum>
-  <w:abstractNum w:abstractNumId="12" w15:restartNumberingAfterBreak="0">
+  <w:abstractNum w:abstractNumId="13" w15:restartNumberingAfterBreak="0">
     <w:nsid w:val="338663DB"/>
     <w:multiLevelType w:val="hybridMultilevel"/>
     <w:tmpl w:val="1D20DFD2"/>
@@ -3924,7 +4893,122 @@
       </w:rPr>
     </w:lvl>
   </w:abstractNum>
-  <w:abstractNum w:abstractNumId="13" w15:restartNumberingAfterBreak="0">
+  <w:abstractNum w:abstractNumId="14" w15:restartNumberingAfterBreak="0">
+    <w:nsid w:val="38253454"/>
+    <w:multiLevelType w:val="hybridMultilevel"/>
+    <w:tmpl w:val="356612FA"/>
+    <w:lvl w:ilvl="0" w:tplc="9D844158">
+      <w:start w:val="1"/>
+      <w:numFmt w:val="bullet"/>
+      <w:lvlText w:val=""/>
+      <w:lvlJc w:val="left"/>
+      <w:pPr>
+        <w:ind w:left="1440" w:hanging="360"/>
+      </w:pPr>
+      <w:rPr>
+        <w:rFonts w:ascii="Symbol" w:eastAsia="Times New Roman" w:hAnsi="Symbol" w:cs="Times New Roman" w:hint="default"/>
+        <w:color w:val="000000"/>
+        <w:sz w:val="24"/>
+      </w:rPr>
+    </w:lvl>
+    <w:lvl w:ilvl="1" w:tplc="04070003" w:tentative="1">
+      <w:start w:val="1"/>
+      <w:numFmt w:val="bullet"/>
+      <w:lvlText w:val="o"/>
+      <w:lvlJc w:val="left"/>
+      <w:pPr>
+        <w:ind w:left="2160" w:hanging="360"/>
+      </w:pPr>
+      <w:rPr>
+        <w:rFonts w:ascii="Courier New" w:hAnsi="Courier New" w:cs="Courier New" w:hint="default"/>
+      </w:rPr>
+    </w:lvl>
+    <w:lvl w:ilvl="2" w:tplc="04070005" w:tentative="1">
+      <w:start w:val="1"/>
+      <w:numFmt w:val="bullet"/>
+      <w:lvlText w:val=""/>
+      <w:lvlJc w:val="left"/>
+      <w:pPr>
+        <w:ind w:left="2880" w:hanging="360"/>
+      </w:pPr>
+      <w:rPr>
+        <w:rFonts w:ascii="Wingdings" w:hAnsi="Wingdings" w:hint="default"/>
+      </w:rPr>
+    </w:lvl>
+    <w:lvl w:ilvl="3" w:tplc="04070001" w:tentative="1">
+      <w:start w:val="1"/>
+      <w:numFmt w:val="bullet"/>
+      <w:lvlText w:val=""/>
+      <w:lvlJc w:val="left"/>
+      <w:pPr>
+        <w:ind w:left="3600" w:hanging="360"/>
+      </w:pPr>
+      <w:rPr>
+        <w:rFonts w:ascii="Symbol" w:hAnsi="Symbol" w:hint="default"/>
+      </w:rPr>
+    </w:lvl>
+    <w:lvl w:ilvl="4" w:tplc="04070003" w:tentative="1">
+      <w:start w:val="1"/>
+      <w:numFmt w:val="bullet"/>
+      <w:lvlText w:val="o"/>
+      <w:lvlJc w:val="left"/>
+      <w:pPr>
+        <w:ind w:left="4320" w:hanging="360"/>
+      </w:pPr>
+      <w:rPr>
+        <w:rFonts w:ascii="Courier New" w:hAnsi="Courier New" w:cs="Courier New" w:hint="default"/>
+      </w:rPr>
+    </w:lvl>
+    <w:lvl w:ilvl="5" w:tplc="04070005" w:tentative="1">
+      <w:start w:val="1"/>
+      <w:numFmt w:val="bullet"/>
+      <w:lvlText w:val=""/>
+      <w:lvlJc w:val="left"/>
+      <w:pPr>
+        <w:ind w:left="5040" w:hanging="360"/>
+      </w:pPr>
+      <w:rPr>
+        <w:rFonts w:ascii="Wingdings" w:hAnsi="Wingdings" w:hint="default"/>
+      </w:rPr>
+    </w:lvl>
+    <w:lvl w:ilvl="6" w:tplc="04070001" w:tentative="1">
+      <w:start w:val="1"/>
+      <w:numFmt w:val="bullet"/>
+      <w:lvlText w:val=""/>
+      <w:lvlJc w:val="left"/>
+      <w:pPr>
+        <w:ind w:left="5760" w:hanging="360"/>
+      </w:pPr>
+      <w:rPr>
+        <w:rFonts w:ascii="Symbol" w:hAnsi="Symbol" w:hint="default"/>
+      </w:rPr>
+    </w:lvl>
+    <w:lvl w:ilvl="7" w:tplc="04070003" w:tentative="1">
+      <w:start w:val="1"/>
+      <w:numFmt w:val="bullet"/>
+      <w:lvlText w:val="o"/>
+      <w:lvlJc w:val="left"/>
+      <w:pPr>
+        <w:ind w:left="6480" w:hanging="360"/>
+      </w:pPr>
+      <w:rPr>
+        <w:rFonts w:ascii="Courier New" w:hAnsi="Courier New" w:cs="Courier New" w:hint="default"/>
+      </w:rPr>
+    </w:lvl>
+    <w:lvl w:ilvl="8" w:tplc="04070005" w:tentative="1">
+      <w:start w:val="1"/>
+      <w:numFmt w:val="bullet"/>
+      <w:lvlText w:val=""/>
+      <w:lvlJc w:val="left"/>
+      <w:pPr>
+        <w:ind w:left="7200" w:hanging="360"/>
+      </w:pPr>
+      <w:rPr>
+        <w:rFonts w:ascii="Wingdings" w:hAnsi="Wingdings" w:hint="default"/>
+      </w:rPr>
+    </w:lvl>
+  </w:abstractNum>
+  <w:abstractNum w:abstractNumId="15" w15:restartNumberingAfterBreak="0">
     <w:nsid w:val="3AA513A7"/>
     <w:multiLevelType w:val="hybridMultilevel"/>
     <w:tmpl w:val="94B445B0"/>
@@ -4037,7 +5121,7 @@
       </w:rPr>
     </w:lvl>
   </w:abstractNum>
-  <w:abstractNum w:abstractNumId="14" w15:restartNumberingAfterBreak="0">
+  <w:abstractNum w:abstractNumId="16" w15:restartNumberingAfterBreak="0">
     <w:nsid w:val="45593C11"/>
     <w:multiLevelType w:val="hybridMultilevel"/>
     <w:tmpl w:val="C2C8FD7C"/>
@@ -4150,7 +5234,7 @@
       </w:rPr>
     </w:lvl>
   </w:abstractNum>
-  <w:abstractNum w:abstractNumId="15" w15:restartNumberingAfterBreak="0">
+  <w:abstractNum w:abstractNumId="17" w15:restartNumberingAfterBreak="0">
     <w:nsid w:val="49D66CF5"/>
     <w:multiLevelType w:val="hybridMultilevel"/>
     <w:tmpl w:val="589847A2"/>
@@ -4239,7 +5323,7 @@
       </w:pPr>
     </w:lvl>
   </w:abstractNum>
-  <w:abstractNum w:abstractNumId="16" w15:restartNumberingAfterBreak="0">
+  <w:abstractNum w:abstractNumId="18" w15:restartNumberingAfterBreak="0">
     <w:nsid w:val="4B967EE4"/>
     <w:multiLevelType w:val="hybridMultilevel"/>
     <w:tmpl w:val="AB44CA96"/>
@@ -4352,7 +5436,7 @@
       </w:rPr>
     </w:lvl>
   </w:abstractNum>
-  <w:abstractNum w:abstractNumId="17" w15:restartNumberingAfterBreak="0">
+  <w:abstractNum w:abstractNumId="19" w15:restartNumberingAfterBreak="0">
     <w:nsid w:val="4FBA5F9F"/>
     <w:multiLevelType w:val="hybridMultilevel"/>
     <w:tmpl w:val="E658519E"/>
@@ -4465,7 +5549,7 @@
       </w:rPr>
     </w:lvl>
   </w:abstractNum>
-  <w:abstractNum w:abstractNumId="18" w15:restartNumberingAfterBreak="0">
+  <w:abstractNum w:abstractNumId="20" w15:restartNumberingAfterBreak="0">
     <w:nsid w:val="52217154"/>
     <w:multiLevelType w:val="hybridMultilevel"/>
     <w:tmpl w:val="9D681A7E"/>
@@ -4554,7 +5638,7 @@
       </w:pPr>
     </w:lvl>
   </w:abstractNum>
-  <w:abstractNum w:abstractNumId="19" w15:restartNumberingAfterBreak="0">
+  <w:abstractNum w:abstractNumId="21" w15:restartNumberingAfterBreak="0">
     <w:nsid w:val="56594B19"/>
     <w:multiLevelType w:val="hybridMultilevel"/>
     <w:tmpl w:val="13260482"/>
@@ -4643,7 +5727,7 @@
       </w:pPr>
     </w:lvl>
   </w:abstractNum>
-  <w:abstractNum w:abstractNumId="20" w15:restartNumberingAfterBreak="0">
+  <w:abstractNum w:abstractNumId="22" w15:restartNumberingAfterBreak="0">
     <w:nsid w:val="5C8514A2"/>
     <w:multiLevelType w:val="hybridMultilevel"/>
     <w:tmpl w:val="39F6EBB4"/>
@@ -4732,7 +5816,7 @@
       </w:pPr>
     </w:lvl>
   </w:abstractNum>
-  <w:abstractNum w:abstractNumId="21" w15:restartNumberingAfterBreak="0">
+  <w:abstractNum w:abstractNumId="23" w15:restartNumberingAfterBreak="0">
     <w:nsid w:val="60294E37"/>
     <w:multiLevelType w:val="hybridMultilevel"/>
     <w:tmpl w:val="870A21C6"/>
@@ -4845,7 +5929,7 @@
       </w:rPr>
     </w:lvl>
   </w:abstractNum>
-  <w:abstractNum w:abstractNumId="22" w15:restartNumberingAfterBreak="0">
+  <w:abstractNum w:abstractNumId="24" w15:restartNumberingAfterBreak="0">
     <w:nsid w:val="6DBF0D80"/>
     <w:multiLevelType w:val="hybridMultilevel"/>
     <w:tmpl w:val="7F2E88D0"/>
@@ -4960,7 +6044,122 @@
       </w:rPr>
     </w:lvl>
   </w:abstractNum>
-  <w:abstractNum w:abstractNumId="23" w15:restartNumberingAfterBreak="0">
+  <w:abstractNum w:abstractNumId="25" w15:restartNumberingAfterBreak="0">
+    <w:nsid w:val="735962BC"/>
+    <w:multiLevelType w:val="hybridMultilevel"/>
+    <w:tmpl w:val="2304A946"/>
+    <w:lvl w:ilvl="0" w:tplc="DB9C8EF8">
+      <w:start w:val="1"/>
+      <w:numFmt w:val="bullet"/>
+      <w:lvlText w:val="-"/>
+      <w:lvlJc w:val="left"/>
+      <w:pPr>
+        <w:ind w:left="1080" w:hanging="360"/>
+      </w:pPr>
+      <w:rPr>
+        <w:rFonts w:ascii="Times New Roman" w:eastAsia="Times New Roman" w:hAnsi="Times New Roman" w:cs="Times New Roman" w:hint="default"/>
+        <w:color w:val="000000"/>
+        <w:sz w:val="24"/>
+      </w:rPr>
+    </w:lvl>
+    <w:lvl w:ilvl="1" w:tplc="04070003" w:tentative="1">
+      <w:start w:val="1"/>
+      <w:numFmt w:val="bullet"/>
+      <w:lvlText w:val="o"/>
+      <w:lvlJc w:val="left"/>
+      <w:pPr>
+        <w:ind w:left="1800" w:hanging="360"/>
+      </w:pPr>
+      <w:rPr>
+        <w:rFonts w:ascii="Courier New" w:hAnsi="Courier New" w:cs="Courier New" w:hint="default"/>
+      </w:rPr>
+    </w:lvl>
+    <w:lvl w:ilvl="2" w:tplc="04070005" w:tentative="1">
+      <w:start w:val="1"/>
+      <w:numFmt w:val="bullet"/>
+      <w:lvlText w:val=""/>
+      <w:lvlJc w:val="left"/>
+      <w:pPr>
+        <w:ind w:left="2520" w:hanging="360"/>
+      </w:pPr>
+      <w:rPr>
+        <w:rFonts w:ascii="Wingdings" w:hAnsi="Wingdings" w:hint="default"/>
+      </w:rPr>
+    </w:lvl>
+    <w:lvl w:ilvl="3" w:tplc="04070001" w:tentative="1">
+      <w:start w:val="1"/>
+      <w:numFmt w:val="bullet"/>
+      <w:lvlText w:val=""/>
+      <w:lvlJc w:val="left"/>
+      <w:pPr>
+        <w:ind w:left="3240" w:hanging="360"/>
+      </w:pPr>
+      <w:rPr>
+        <w:rFonts w:ascii="Symbol" w:hAnsi="Symbol" w:hint="default"/>
+      </w:rPr>
+    </w:lvl>
+    <w:lvl w:ilvl="4" w:tplc="04070003" w:tentative="1">
+      <w:start w:val="1"/>
+      <w:numFmt w:val="bullet"/>
+      <w:lvlText w:val="o"/>
+      <w:lvlJc w:val="left"/>
+      <w:pPr>
+        <w:ind w:left="3960" w:hanging="360"/>
+      </w:pPr>
+      <w:rPr>
+        <w:rFonts w:ascii="Courier New" w:hAnsi="Courier New" w:cs="Courier New" w:hint="default"/>
+      </w:rPr>
+    </w:lvl>
+    <w:lvl w:ilvl="5" w:tplc="04070005" w:tentative="1">
+      <w:start w:val="1"/>
+      <w:numFmt w:val="bullet"/>
+      <w:lvlText w:val=""/>
+      <w:lvlJc w:val="left"/>
+      <w:pPr>
+        <w:ind w:left="4680" w:hanging="360"/>
+      </w:pPr>
+      <w:rPr>
+        <w:rFonts w:ascii="Wingdings" w:hAnsi="Wingdings" w:hint="default"/>
+      </w:rPr>
+    </w:lvl>
+    <w:lvl w:ilvl="6" w:tplc="04070001" w:tentative="1">
+      <w:start w:val="1"/>
+      <w:numFmt w:val="bullet"/>
+      <w:lvlText w:val=""/>
+      <w:lvlJc w:val="left"/>
+      <w:pPr>
+        <w:ind w:left="5400" w:hanging="360"/>
+      </w:pPr>
+      <w:rPr>
+        <w:rFonts w:ascii="Symbol" w:hAnsi="Symbol" w:hint="default"/>
+      </w:rPr>
+    </w:lvl>
+    <w:lvl w:ilvl="7" w:tplc="04070003" w:tentative="1">
+      <w:start w:val="1"/>
+      <w:numFmt w:val="bullet"/>
+      <w:lvlText w:val="o"/>
+      <w:lvlJc w:val="left"/>
+      <w:pPr>
+        <w:ind w:left="6120" w:hanging="360"/>
+      </w:pPr>
+      <w:rPr>
+        <w:rFonts w:ascii="Courier New" w:hAnsi="Courier New" w:cs="Courier New" w:hint="default"/>
+      </w:rPr>
+    </w:lvl>
+    <w:lvl w:ilvl="8" w:tplc="04070005" w:tentative="1">
+      <w:start w:val="1"/>
+      <w:numFmt w:val="bullet"/>
+      <w:lvlText w:val=""/>
+      <w:lvlJc w:val="left"/>
+      <w:pPr>
+        <w:ind w:left="6840" w:hanging="360"/>
+      </w:pPr>
+      <w:rPr>
+        <w:rFonts w:ascii="Wingdings" w:hAnsi="Wingdings" w:hint="default"/>
+      </w:rPr>
+    </w:lvl>
+  </w:abstractNum>
+  <w:abstractNum w:abstractNumId="26" w15:restartNumberingAfterBreak="0">
     <w:nsid w:val="79A45B78"/>
     <w:multiLevelType w:val="hybridMultilevel"/>
     <w:tmpl w:val="D56E8468"/>
@@ -5073,7 +6272,7 @@
       </w:rPr>
     </w:lvl>
   </w:abstractNum>
-  <w:abstractNum w:abstractNumId="24" w15:restartNumberingAfterBreak="0">
+  <w:abstractNum w:abstractNumId="27" w15:restartNumberingAfterBreak="0">
     <w:nsid w:val="7B693DF1"/>
     <w:multiLevelType w:val="multilevel"/>
     <w:tmpl w:val="0A5E1AFC"/>
@@ -5186,7 +6385,7 @@
       </w:rPr>
     </w:lvl>
   </w:abstractNum>
-  <w:abstractNum w:abstractNumId="25" w15:restartNumberingAfterBreak="0">
+  <w:abstractNum w:abstractNumId="28" w15:restartNumberingAfterBreak="0">
     <w:nsid w:val="7CBE57E8"/>
     <w:multiLevelType w:val="multilevel"/>
     <w:tmpl w:val="CC823A7A"/>
@@ -5301,25 +6500,25 @@
     </w:lvl>
   </w:abstractNum>
   <w:num w:numId="1" w16cid:durableId="1339693363">
-    <w:abstractNumId w:val="25"/>
+    <w:abstractNumId w:val="28"/>
   </w:num>
   <w:num w:numId="2" w16cid:durableId="1313873075">
-    <w:abstractNumId w:val="15"/>
+    <w:abstractNumId w:val="17"/>
   </w:num>
   <w:num w:numId="3" w16cid:durableId="1073628963">
-    <w:abstractNumId w:val="24"/>
+    <w:abstractNumId w:val="27"/>
   </w:num>
   <w:num w:numId="4" w16cid:durableId="1620644336">
-    <w:abstractNumId w:val="19"/>
+    <w:abstractNumId w:val="21"/>
   </w:num>
   <w:num w:numId="5" w16cid:durableId="1819225459">
-    <w:abstractNumId w:val="12"/>
+    <w:abstractNumId w:val="13"/>
   </w:num>
   <w:num w:numId="6" w16cid:durableId="396126666">
-    <w:abstractNumId w:val="21"/>
+    <w:abstractNumId w:val="23"/>
   </w:num>
   <w:num w:numId="7" w16cid:durableId="1635060064">
-    <w:abstractNumId w:val="13"/>
+    <w:abstractNumId w:val="15"/>
   </w:num>
   <w:num w:numId="8" w16cid:durableId="1049840439">
     <w:abstractNumId w:val="0"/>
@@ -5352,31 +6551,40 @@
     <w:abstractNumId w:val="9"/>
   </w:num>
   <w:num w:numId="18" w16cid:durableId="941111679">
-    <w:abstractNumId w:val="17"/>
+    <w:abstractNumId w:val="19"/>
   </w:num>
   <w:num w:numId="19" w16cid:durableId="1628849920">
+    <w:abstractNumId w:val="22"/>
+  </w:num>
+  <w:num w:numId="20" w16cid:durableId="2079739783">
+    <w:abstractNumId w:val="11"/>
+  </w:num>
+  <w:num w:numId="21" w16cid:durableId="1084305012">
+    <w:abstractNumId w:val="18"/>
+  </w:num>
+  <w:num w:numId="22" w16cid:durableId="1501195645">
+    <w:abstractNumId w:val="12"/>
+  </w:num>
+  <w:num w:numId="23" w16cid:durableId="876087238">
+    <w:abstractNumId w:val="26"/>
+  </w:num>
+  <w:num w:numId="24" w16cid:durableId="759448494">
+    <w:abstractNumId w:val="24"/>
+  </w:num>
+  <w:num w:numId="25" w16cid:durableId="2135979379">
+    <w:abstractNumId w:val="16"/>
+  </w:num>
+  <w:num w:numId="26" w16cid:durableId="1181821576">
     <w:abstractNumId w:val="20"/>
   </w:num>
-  <w:num w:numId="20" w16cid:durableId="2079739783">
+  <w:num w:numId="27" w16cid:durableId="311063284">
     <w:abstractNumId w:val="10"/>
   </w:num>
-  <w:num w:numId="21" w16cid:durableId="1084305012">
-    <w:abstractNumId w:val="16"/>
+  <w:num w:numId="28" w16cid:durableId="690645255">
+    <w:abstractNumId w:val="25"/>
   </w:num>
-  <w:num w:numId="22" w16cid:durableId="1501195645">
-    <w:abstractNumId w:val="11"/>
-  </w:num>
-  <w:num w:numId="23" w16cid:durableId="876087238">
-    <w:abstractNumId w:val="23"/>
-  </w:num>
-  <w:num w:numId="24" w16cid:durableId="759448494">
-    <w:abstractNumId w:val="22"/>
-  </w:num>
-  <w:num w:numId="25" w16cid:durableId="2135979379">
+  <w:num w:numId="29" w16cid:durableId="734280596">
     <w:abstractNumId w:val="14"/>
-  </w:num>
-  <w:num w:numId="26" w16cid:durableId="1181821576">
-    <w:abstractNumId w:val="18"/>
   </w:num>
 </w:numbering>
 </file>
@@ -6348,7 +7556,6 @@
     <w:name w:val="Normal (Web)"/>
     <w:basedOn w:val="Standard"/>
     <w:uiPriority w:val="99"/>
-    <w:semiHidden/>
     <w:unhideWhenUsed/>
     <w:rsid w:val="00A11DFC"/>
     <w:pPr>
@@ -10635,6 +11842,16 @@
       <w:lang w:eastAsia="de-DE"/>
       <w14:ligatures w14:val="none"/>
     </w:rPr>
+  </w:style>
+  <w:style w:type="character" w:customStyle="1" w:styleId="apple-converted-space">
+    <w:name w:val="apple-converted-space"/>
+    <w:basedOn w:val="Absatz-Standardschriftart"/>
+    <w:rsid w:val="0024098D"/>
+  </w:style>
+  <w:style w:type="character" w:customStyle="1" w:styleId="whitespace-normal">
+    <w:name w:val="whitespace-normal"/>
+    <w:basedOn w:val="Absatz-Standardschriftart"/>
+    <w:rsid w:val="0024098D"/>
   </w:style>
 </w:styles>
 </file>

</xml_diff>

<commit_message>
Weitere Bearbeitung am Word Dokument
</commit_message>
<xml_diff>
--- a/Doku/ Doku Program.docx
+++ b/Doku/ Doku Program.docx
@@ -35,18 +35,20 @@
           <w:p/>
           <w:p/>
           <w:p>
+            <w:pPr>
+              <w:jc w:val="center"/>
+            </w:pPr>
             <w:r>
               <w:rPr>
                 <w:sz w:val="28"/>
               </w:rPr>
-              <w:t>Erstellen eines Spiels in Visual Basic mit dem Titel (</w:t>
+              <w:t>Erstellen eines Spiels in Visual Basic</w:t>
             </w:r>
             <w:r>
               <w:rPr>
                 <w:sz w:val="28"/>
-                <w:highlight w:val="yellow"/>
               </w:rPr>
-              <w:t>…</w:t>
+              <w:t xml:space="preserve"> (Geisterfahrer mit Demenz</w:t>
             </w:r>
             <w:r>
               <w:rPr>
@@ -55,7 +57,11 @@
               <w:t>)</w:t>
             </w:r>
           </w:p>
-          <w:p/>
+          <w:p>
+            <w:pPr>
+              <w:jc w:val="center"/>
+            </w:pPr>
+          </w:p>
           <w:p>
             <w:pPr>
               <w:pStyle w:val="Kopfzeile"/>
@@ -1994,6 +2000,7 @@
         <w:t>Vorüberlegungen zur Lösung</w:t>
       </w:r>
     </w:p>
+    <w:p/>
     <w:p>
       <w:pPr>
         <w:pStyle w:val="Listenabsatz"/>
@@ -3034,16 +3041,186 @@
     </w:p>
     <w:p>
       <w:pPr>
+        <w:keepNext/>
+        <w:tabs>
+          <w:tab w:val="clear" w:pos="1134"/>
+          <w:tab w:val="clear" w:pos="2268"/>
+        </w:tabs>
+        <w:spacing w:line="240" w:lineRule="auto"/>
+      </w:pPr>
+      <w:r>
         <w:rPr>
           <w:rFonts w:ascii="Times New Roman" w:hAnsi="Times New Roman"/>
-        </w:rPr>
-      </w:pPr>
-      <w:r>
+          <w:color w:val="000000"/>
+          <w:szCs w:val="22"/>
+        </w:rPr>
+        <w:drawing>
+          <wp:inline distT="0" distB="0" distL="0" distR="0" wp14:anchorId="61067B33" wp14:editId="4036C1B4">
+            <wp:extent cx="5759450" cy="1095375"/>
+            <wp:effectExtent l="0" t="0" r="6350" b="0"/>
+            <wp:docPr id="120281421" name="Grafik 1"/>
+            <wp:cNvGraphicFramePr>
+              <a:graphicFrameLocks xmlns:a="http://schemas.openxmlformats.org/drawingml/2006/main" noChangeAspect="1"/>
+            </wp:cNvGraphicFramePr>
+            <a:graphic xmlns:a="http://schemas.openxmlformats.org/drawingml/2006/main">
+              <a:graphicData uri="http://schemas.openxmlformats.org/drawingml/2006/picture">
+                <pic:pic xmlns:pic="http://schemas.openxmlformats.org/drawingml/2006/picture">
+                  <pic:nvPicPr>
+                    <pic:cNvPr id="120281421" name=""/>
+                    <pic:cNvPicPr/>
+                  </pic:nvPicPr>
+                  <pic:blipFill>
+                    <a:blip r:embed="rId11"/>
+                    <a:stretch>
+                      <a:fillRect/>
+                    </a:stretch>
+                  </pic:blipFill>
+                  <pic:spPr>
+                    <a:xfrm>
+                      <a:off x="0" y="0"/>
+                      <a:ext cx="5759450" cy="1095375"/>
+                    </a:xfrm>
+                    <a:prstGeom prst="rect">
+                      <a:avLst/>
+                    </a:prstGeom>
+                  </pic:spPr>
+                </pic:pic>
+              </a:graphicData>
+            </a:graphic>
+          </wp:inline>
+        </w:drawing>
+      </w:r>
+    </w:p>
+    <w:p>
+      <w:pPr>
+        <w:pStyle w:val="Beschriftung"/>
         <w:rPr>
           <w:rFonts w:ascii="Times New Roman" w:hAnsi="Times New Roman"/>
-          <w:highlight w:val="yellow"/>
-        </w:rPr>
-        <w:t>Nutzwertanalyse</w:t>
+          <w:color w:val="000000"/>
+          <w:szCs w:val="22"/>
+        </w:rPr>
+      </w:pPr>
+      <w:r>
+        <w:t xml:space="preserve">Abbildung </w:t>
+      </w:r>
+      <w:fldSimple w:instr=" SEQ Abbildung \* ARABIC ">
+        <w:r>
+          <w:rPr>
+            <w:noProof/>
+          </w:rPr>
+          <w:t>1</w:t>
+        </w:r>
+      </w:fldSimple>
+      <w:r>
+        <w:t>: Nutzwertanalyse zur Evaluierung</w:t>
+      </w:r>
+      <w:r>
+        <w:rPr>
+          <w:rFonts w:ascii="Times New Roman" w:hAnsi="Times New Roman"/>
+        </w:rPr>
+        <w:br w:type="page"/>
+      </w:r>
+    </w:p>
+    <w:p>
+      <w:pPr>
+        <w:pStyle w:val="berschrift1"/>
+      </w:pPr>
+      <w:r>
+        <w:lastRenderedPageBreak/>
+        <w:t xml:space="preserve">Umsetzung und Implementierung </w:t>
+      </w:r>
+    </w:p>
+    <w:p>
+      <w:pPr>
+        <w:pStyle w:val="Listenabsatz"/>
+        <w:numPr>
+          <w:ilvl w:val="0"/>
+          <w:numId w:val="26"/>
+        </w:numPr>
+      </w:pPr>
+      <w:r>
+        <w:t>Fahrspuren</w:t>
+      </w:r>
+      <w:r>
+        <w:t>, Unterschiedliche Autos mit Lebensabzug</w:t>
+      </w:r>
+    </w:p>
+    <w:p>
+      <w:pPr>
+        <w:pStyle w:val="Listenabsatz"/>
+        <w:numPr>
+          <w:ilvl w:val="0"/>
+          <w:numId w:val="26"/>
+        </w:numPr>
+      </w:pPr>
+      <w:r>
+        <w:t>Start und Endscreen</w:t>
+      </w:r>
+    </w:p>
+    <w:p>
+      <w:pPr>
+        <w:pStyle w:val="Listenabsatz"/>
+        <w:numPr>
+          <w:ilvl w:val="0"/>
+          <w:numId w:val="26"/>
+        </w:numPr>
+      </w:pPr>
+      <w:r>
+        <w:t xml:space="preserve">Funktionen des </w:t>
+      </w:r>
+      <w:r>
+        <w:t>S</w:t>
+      </w:r>
+      <w:r>
+        <w:t xml:space="preserve">creens (Musik-Auswahl, Scoreboard, Anleitung mit Storyline, Skin Auswahl, Start, Randparameter </w:t>
+      </w:r>
+      <w:r>
+        <w:t>W</w:t>
+      </w:r>
+      <w:r>
+        <w:t xml:space="preserve">ahl (wieviel </w:t>
+      </w:r>
+      <w:r>
+        <w:t>A</w:t>
+      </w:r>
+      <w:r>
+        <w:t xml:space="preserve">utos, wie schnell,) </w:t>
+      </w:r>
+    </w:p>
+    <w:p>
+      <w:pPr>
+        <w:pStyle w:val="Listenabsatz"/>
+        <w:numPr>
+          <w:ilvl w:val="0"/>
+          <w:numId w:val="26"/>
+        </w:numPr>
+      </w:pPr>
+      <w:r>
+        <w:t>Items</w:t>
+      </w:r>
+    </w:p>
+    <w:p>
+      <w:pPr>
+        <w:pStyle w:val="Listenabsatz"/>
+        <w:numPr>
+          <w:ilvl w:val="0"/>
+          <w:numId w:val="26"/>
+        </w:numPr>
+      </w:pPr>
+      <w:r>
+        <w:t>Brücke mit Polizei</w:t>
+      </w:r>
+    </w:p>
+    <w:p>
+      <w:pPr>
+        <w:pStyle w:val="Listenabsatz"/>
+        <w:numPr>
+          <w:ilvl w:val="0"/>
+          <w:numId w:val="26"/>
+        </w:numPr>
+      </w:pPr>
+      <w:r>
+        <w:t>Implementierung von Freischaltbaren Skins</w:t>
       </w:r>
     </w:p>
     <w:p>
@@ -3053,131 +3230,6 @@
           <w:tab w:val="clear" w:pos="2268"/>
         </w:tabs>
         <w:spacing w:after="160" w:line="259" w:lineRule="auto"/>
-        <w:rPr>
-          <w:rFonts w:ascii="Times New Roman" w:hAnsi="Times New Roman"/>
-        </w:rPr>
-      </w:pPr>
-      <w:r>
-        <w:rPr>
-          <w:rFonts w:ascii="Times New Roman" w:hAnsi="Times New Roman"/>
-        </w:rPr>
-        <w:br w:type="page"/>
-      </w:r>
-    </w:p>
-    <w:p>
-      <w:pPr>
-        <w:pStyle w:val="berschrift1"/>
-      </w:pPr>
-      <w:r>
-        <w:lastRenderedPageBreak/>
-        <w:t xml:space="preserve">Umsetzung und Implementierung </w:t>
-      </w:r>
-    </w:p>
-    <w:p>
-      <w:pPr>
-        <w:pStyle w:val="Listenabsatz"/>
-        <w:numPr>
-          <w:ilvl w:val="0"/>
-          <w:numId w:val="26"/>
-        </w:numPr>
-      </w:pPr>
-      <w:r>
-        <w:t>Fahrspuren</w:t>
-      </w:r>
-      <w:r>
-        <w:t>, Unterschiedliche Autos mit Lebensabzug</w:t>
-      </w:r>
-    </w:p>
-    <w:p>
-      <w:pPr>
-        <w:pStyle w:val="Listenabsatz"/>
-        <w:numPr>
-          <w:ilvl w:val="0"/>
-          <w:numId w:val="26"/>
-        </w:numPr>
-      </w:pPr>
-      <w:r>
-        <w:t>Start und Endscreen</w:t>
-      </w:r>
-    </w:p>
-    <w:p>
-      <w:pPr>
-        <w:pStyle w:val="Listenabsatz"/>
-        <w:numPr>
-          <w:ilvl w:val="0"/>
-          <w:numId w:val="26"/>
-        </w:numPr>
-      </w:pPr>
-      <w:r>
-        <w:t xml:space="preserve">Funktionen des </w:t>
-      </w:r>
-      <w:r>
-        <w:t>S</w:t>
-      </w:r>
-      <w:r>
-        <w:t xml:space="preserve">creens (Musik-Auswahl, Scoreboard, Anleitung mit Storyline, Skin Auswahl, Start, Randparameter </w:t>
-      </w:r>
-      <w:r>
-        <w:t>W</w:t>
-      </w:r>
-      <w:r>
-        <w:t xml:space="preserve">ahl (wieviel </w:t>
-      </w:r>
-      <w:r>
-        <w:t>A</w:t>
-      </w:r>
-      <w:r>
-        <w:t>utos, wie schnell,</w:t>
-      </w:r>
-      <w:proofErr w:type="gramStart"/>
-      <w:r>
-        <w:t>) )</w:t>
-      </w:r>
-      <w:proofErr w:type="gramEnd"/>
-    </w:p>
-    <w:p>
-      <w:pPr>
-        <w:pStyle w:val="Listenabsatz"/>
-        <w:numPr>
-          <w:ilvl w:val="0"/>
-          <w:numId w:val="26"/>
-        </w:numPr>
-      </w:pPr>
-      <w:r>
-        <w:t>Items</w:t>
-      </w:r>
-    </w:p>
-    <w:p>
-      <w:pPr>
-        <w:pStyle w:val="Listenabsatz"/>
-        <w:numPr>
-          <w:ilvl w:val="0"/>
-          <w:numId w:val="26"/>
-        </w:numPr>
-      </w:pPr>
-      <w:r>
-        <w:t>Brücke mit Polizei</w:t>
-      </w:r>
-    </w:p>
-    <w:p>
-      <w:pPr>
-        <w:pStyle w:val="Listenabsatz"/>
-        <w:numPr>
-          <w:ilvl w:val="0"/>
-          <w:numId w:val="26"/>
-        </w:numPr>
-      </w:pPr>
-      <w:r>
-        <w:t>Implementierung von Freischaltbaren Skins</w:t>
-      </w:r>
-    </w:p>
-    <w:p>
-      <w:pPr>
-        <w:tabs>
-          <w:tab w:val="clear" w:pos="1134"/>
-          <w:tab w:val="clear" w:pos="2268"/>
-        </w:tabs>
-        <w:spacing w:after="160" w:line="259" w:lineRule="auto"/>
       </w:pPr>
       <w:r>
         <w:br w:type="page"/>
@@ -3208,13 +3260,8 @@
           <w:numId w:val="22"/>
         </w:numPr>
       </w:pPr>
-    </w:p>
-    <w:p>
-      <w:pPr>
-        <w:pStyle w:val="berschrift2"/>
-      </w:pPr>
-      <w:r>
-        <w:t>Hindernisse</w:t>
+      <w:r>
+        <w:t>Es soll ein Intro automatisch beim Starten des Spiels abgespielt werden</w:t>
       </w:r>
     </w:p>
     <w:p>
@@ -3226,7 +3273,7 @@
         </w:numPr>
       </w:pPr>
       <w:r>
-        <w:t>Jede Zeile besteht aus mind. 1 und maximal fünf Hindernisblocks</w:t>
+        <w:t>Nach dem Intro soll ein Bildschirm mit Optionen angezeigt werden</w:t>
       </w:r>
     </w:p>
     <w:p>
@@ -3238,11 +3285,23 @@
         </w:numPr>
       </w:pPr>
       <w:r>
-        <w:t xml:space="preserve">Jeder Hindernisblock besteht aus mindestens einem, maximal neun </w:t>
-      </w:r>
-      <w:r>
-        <w:br/>
-        <w:t>(einzel-)Hindernissen</w:t>
+        <w:t xml:space="preserve">Es soll eine Auswahl für den User geben welche Schwierigkeit er möchte oder </w:t>
+      </w:r>
+      <w:proofErr w:type="spellStart"/>
+      <w:r>
+        <w:t>Advanced</w:t>
+      </w:r>
+      <w:proofErr w:type="spellEnd"/>
+      <w:r>
+        <w:t xml:space="preserve"> Settings wo die </w:t>
+      </w:r>
+      <w:proofErr w:type="spellStart"/>
+      <w:r>
+        <w:t>Paramter</w:t>
+      </w:r>
+      <w:proofErr w:type="spellEnd"/>
+      <w:r>
+        <w:t xml:space="preserve"> vom User bestimmt werden können</w:t>
       </w:r>
     </w:p>
     <w:p>
@@ -3254,7 +3313,7 @@
         </w:numPr>
       </w:pPr>
       <w:r>
-        <w:t>Hindernisblocks sind zufällig über die Zeile verteilt</w:t>
+        <w:t>Die Musik soll über eine Auswahl ein- oder ausgeschaltet werden können</w:t>
       </w:r>
     </w:p>
     <w:p>
@@ -3266,7 +3325,7 @@
         </w:numPr>
       </w:pPr>
       <w:r>
-        <w:t>Die Hindernisblocks wandern Zeilenweiße nach unten</w:t>
+        <w:t>Über den Punkt „Anleitung“ soll eine Kurze Beschreibung kommen, wie das Spiel bedient werden kann und was es für Items gibt</w:t>
       </w:r>
     </w:p>
     <w:p>
@@ -3278,7 +3337,7 @@
         </w:numPr>
       </w:pPr>
       <w:r>
-        <w:t>Hindernisblocks erscheinen in der obersten Zeile</w:t>
+        <w:t>Die Farbe des Autos kann über den Punkt „Farbanpassung“ geändert werden</w:t>
       </w:r>
     </w:p>
     <w:p>
@@ -3290,25 +3349,15 @@
         </w:numPr>
       </w:pPr>
       <w:r>
-        <w:t xml:space="preserve">Das Spielfeld besteht aus </w:t>
-      </w:r>
-      <w:r>
-        <w:rPr>
-          <w:highlight w:val="yellow"/>
-        </w:rPr>
-        <w:t>24</w:t>
-      </w:r>
-      <w:r>
-        <w:t xml:space="preserve"> Zeilen und </w:t>
-      </w:r>
-      <w:r>
-        <w:rPr>
-          <w:highlight w:val="yellow"/>
-        </w:rPr>
-        <w:t>80</w:t>
-      </w:r>
-      <w:r>
-        <w:t xml:space="preserve"> Spalten</w:t>
+        <w:t>Über den Punkt „Spiel Starten“ soll das Spiel gestartet werden</w:t>
+      </w:r>
+    </w:p>
+    <w:p>
+      <w:pPr>
+        <w:pStyle w:val="berschrift2"/>
+      </w:pPr>
+      <w:r>
+        <w:t>Hindernisse</w:t>
       </w:r>
     </w:p>
     <w:p>
@@ -3320,30 +3369,7 @@
         </w:numPr>
       </w:pPr>
       <w:r>
-        <w:t>Alle Hindernisse werden durch das Zeichen „</w:t>
-      </w:r>
-      <w:r>
-        <w:rPr>
-          <w:highlight w:val="yellow"/>
-        </w:rPr>
-        <w:t>X</w:t>
-      </w:r>
-      <w:r>
-        <w:t>“ dargestellt</w:t>
-      </w:r>
-    </w:p>
-    <w:p>
-      <w:pPr>
-        <w:pStyle w:val="Listenabsatz"/>
-        <w:ind w:left="1080"/>
-      </w:pPr>
-    </w:p>
-    <w:p>
-      <w:pPr>
-        <w:pStyle w:val="berschrift2"/>
-      </w:pPr>
-      <w:r>
-        <w:t>Spielfigur</w:t>
+        <w:t>Jede Zeile besteht aus mind. 1 und maximal fünf Hindernisblocks</w:t>
       </w:r>
     </w:p>
     <w:p>
@@ -3355,7 +3381,11 @@
         </w:numPr>
       </w:pPr>
       <w:r>
-        <w:t>Die Spielfigur wird in der untersten Zeile des Spielfelds dargestellt</w:t>
+        <w:t xml:space="preserve">Jeder Hindernisblock besteht aus mindestens einem, maximal neun </w:t>
+      </w:r>
+      <w:r>
+        <w:br/>
+        <w:t>(einzel-)Hindernissen</w:t>
       </w:r>
     </w:p>
     <w:p>
@@ -3367,16 +3397,7 @@
         </w:numPr>
       </w:pPr>
       <w:r>
-        <w:t>Sie wird durch das Zeichen „</w:t>
-      </w:r>
-      <w:r>
-        <w:rPr>
-          <w:highlight w:val="yellow"/>
-        </w:rPr>
-        <w:t>0</w:t>
-      </w:r>
-      <w:r>
-        <w:t>“ dargestellt</w:t>
+        <w:t>Hindernisblocks sind zufällig über die Zeile verteilt</w:t>
       </w:r>
     </w:p>
     <w:p>
@@ -3388,15 +3409,7 @@
         </w:numPr>
       </w:pPr>
       <w:r>
-        <w:t xml:space="preserve">Sie kann durch Drücken des Cursors–Tasten </w:t>
-      </w:r>
-      <w:proofErr w:type="gramStart"/>
-      <w:r>
-        <w:t>( -</w:t>
-      </w:r>
-      <w:proofErr w:type="gramEnd"/>
-      <w:r>
-        <w:t>&gt; /&lt;-) nach links oder rechts bewegt werden</w:t>
+        <w:t>Die Hindernisblocks wandern Zeilenweiße nach unten</w:t>
       </w:r>
     </w:p>
     <w:p>
@@ -3408,7 +3421,7 @@
         </w:numPr>
       </w:pPr>
       <w:r>
-        <w:t>Kurzes Drücken bewegt die Spielfigur um eine Spalte</w:t>
+        <w:t>Hindernisblocks erscheinen in der obersten Zeile</w:t>
       </w:r>
     </w:p>
     <w:p>
@@ -3420,7 +3433,25 @@
         </w:numPr>
       </w:pPr>
       <w:r>
-        <w:t>Wird eine Cursortaste länger gedrückt, bewegt sich die Spielfigur schnell</w:t>
+        <w:t xml:space="preserve">Das Spielfeld besteht aus </w:t>
+      </w:r>
+      <w:r>
+        <w:rPr>
+          <w:highlight w:val="yellow"/>
+        </w:rPr>
+        <w:t>24</w:t>
+      </w:r>
+      <w:r>
+        <w:t xml:space="preserve"> Zeilen und </w:t>
+      </w:r>
+      <w:r>
+        <w:rPr>
+          <w:highlight w:val="yellow"/>
+        </w:rPr>
+        <w:t>80</w:t>
+      </w:r>
+      <w:r>
+        <w:t xml:space="preserve"> Spalten</w:t>
       </w:r>
     </w:p>
     <w:p>
@@ -3432,7 +3463,30 @@
         </w:numPr>
       </w:pPr>
       <w:r>
-        <w:t>Beim Loslassen der Cursortaste bleibt die Spielfigur sofort stehen</w:t>
+        <w:t>Alle Hindernisse werden durch das Zeichen „</w:t>
+      </w:r>
+      <w:r>
+        <w:rPr>
+          <w:highlight w:val="yellow"/>
+        </w:rPr>
+        <w:t>X</w:t>
+      </w:r>
+      <w:r>
+        <w:t>“ dargestellt</w:t>
+      </w:r>
+    </w:p>
+    <w:p>
+      <w:pPr>
+        <w:pStyle w:val="Listenabsatz"/>
+        <w:ind w:left="1080"/>
+      </w:pPr>
+    </w:p>
+    <w:p>
+      <w:pPr>
+        <w:pStyle w:val="berschrift2"/>
+      </w:pPr>
+      <w:r>
+        <w:t>Spielfigur</w:t>
       </w:r>
     </w:p>
     <w:p>
@@ -3444,7 +3498,7 @@
         </w:numPr>
       </w:pPr>
       <w:r>
-        <w:t>Die Bewegung wird durch den Spielfeldrand begrenzt</w:t>
+        <w:t>Die Spielfigur wird in der untersten Zeile des Spielfelds dargestellt</w:t>
       </w:r>
     </w:p>
     <w:p>
@@ -3456,21 +3510,16 @@
         </w:numPr>
       </w:pPr>
       <w:r>
-        <w:t>Bei Kollision der Spielfigur mit einem Hindernis verliert der Spieler ein Leben und es wir ein Ton ausgegeben</w:t>
-      </w:r>
-    </w:p>
-    <w:p>
-      <w:pPr>
-        <w:pStyle w:val="Listenabsatz"/>
-        <w:ind w:left="1080"/>
-      </w:pPr>
-    </w:p>
-    <w:p>
-      <w:pPr>
-        <w:pStyle w:val="berschrift2"/>
-      </w:pPr>
-      <w:r>
-        <w:t>Spielablauf</w:t>
+        <w:t>Sie wird durch das Zeichen „</w:t>
+      </w:r>
+      <w:r>
+        <w:rPr>
+          <w:highlight w:val="yellow"/>
+        </w:rPr>
+        <w:t>0</w:t>
+      </w:r>
+      <w:r>
+        <w:t>“ dargestellt</w:t>
       </w:r>
     </w:p>
     <w:p>
@@ -3482,7 +3531,15 @@
         </w:numPr>
       </w:pPr>
       <w:r>
-        <w:t>Das Spiel endet, wenn der Spieler keine Leben mehr hat</w:t>
+        <w:t xml:space="preserve">Sie kann durch Drücken des Cursors–Tasten </w:t>
+      </w:r>
+      <w:proofErr w:type="gramStart"/>
+      <w:r>
+        <w:t>( -</w:t>
+      </w:r>
+      <w:proofErr w:type="gramEnd"/>
+      <w:r>
+        <w:t>&gt; /&lt;-) nach links oder rechts bewegt werden</w:t>
       </w:r>
     </w:p>
     <w:p>
@@ -3494,16 +3551,7 @@
         </w:numPr>
       </w:pPr>
       <w:r>
-        <w:t xml:space="preserve">Die Anzahl der verbleibenden Leben wird </w:t>
-      </w:r>
-      <w:r>
-        <w:rPr>
-          <w:highlight w:val="yellow"/>
-        </w:rPr>
-        <w:t>rechts oben</w:t>
-      </w:r>
-      <w:r>
-        <w:t xml:space="preserve"> angezeigt</w:t>
+        <w:t>Kurzes Drücken bewegt die Spielfigur um eine Spalte</w:t>
       </w:r>
     </w:p>
     <w:p>
@@ -3515,7 +3563,7 @@
         </w:numPr>
       </w:pPr>
       <w:r>
-        <w:t>Zu Beginn des Spiels ist das Spielfeld leer</w:t>
+        <w:t>Wird eine Cursortaste länger gedrückt, bewegt sich die Spielfigur schnell</w:t>
       </w:r>
     </w:p>
     <w:p>
@@ -3527,7 +3575,7 @@
         </w:numPr>
       </w:pPr>
       <w:r>
-        <w:t>Im Spielverlauf nimmt die Geschwindigkeit der Hindernisse zu</w:t>
+        <w:t>Beim Loslassen der Cursortaste bleibt die Spielfigur sofort stehen</w:t>
       </w:r>
     </w:p>
     <w:p>
@@ -3539,15 +3587,7 @@
         </w:numPr>
       </w:pPr>
       <w:r>
-        <w:t xml:space="preserve">Im Spielverlauf nimmt die </w:t>
-      </w:r>
-      <w:proofErr w:type="spellStart"/>
-      <w:r>
-        <w:t>Hindernissdichte</w:t>
-      </w:r>
-      <w:proofErr w:type="spellEnd"/>
-      <w:r>
-        <w:t xml:space="preserve"> zu</w:t>
+        <w:t>Die Bewegung wird durch den Spielfeldrand begrenzt</w:t>
       </w:r>
     </w:p>
     <w:p>
@@ -3559,18 +3599,21 @@
         </w:numPr>
       </w:pPr>
       <w:r>
-        <w:t xml:space="preserve">Beim Spielende wird „Game Over“ angezeigt `Nähere </w:t>
-      </w:r>
-      <w:proofErr w:type="spellStart"/>
-      <w:r>
-        <w:t>infos</w:t>
-      </w:r>
-      <w:proofErr w:type="spellEnd"/>
-      <w:r>
-        <w:t xml:space="preserve"> unter </w:t>
-      </w:r>
-      <w:r>
-        <w:t>Pause/End Menü</w:t>
+        <w:t>Bei Kollision der Spielfigur mit einem Hindernis verliert der Spieler ein Leben und es wir ein Ton ausgegeben</w:t>
+      </w:r>
+    </w:p>
+    <w:p>
+      <w:pPr>
+        <w:pStyle w:val="Listenabsatz"/>
+        <w:ind w:left="1080"/>
+      </w:pPr>
+    </w:p>
+    <w:p>
+      <w:pPr>
+        <w:pStyle w:val="berschrift2"/>
+      </w:pPr>
+      <w:r>
+        <w:t>Spielablauf</w:t>
       </w:r>
     </w:p>
     <w:p>
@@ -3582,6 +3625,104 @@
         </w:numPr>
       </w:pPr>
       <w:r>
+        <w:t>Das Spiel endet, wenn der Spieler keine Leben mehr hat</w:t>
+      </w:r>
+    </w:p>
+    <w:p>
+      <w:pPr>
+        <w:pStyle w:val="Listenabsatz"/>
+        <w:numPr>
+          <w:ilvl w:val="0"/>
+          <w:numId w:val="22"/>
+        </w:numPr>
+      </w:pPr>
+      <w:r>
+        <w:t xml:space="preserve">Die Anzahl der verbleibenden Leben wird </w:t>
+      </w:r>
+      <w:r>
+        <w:rPr>
+          <w:highlight w:val="yellow"/>
+        </w:rPr>
+        <w:t>rechts oben</w:t>
+      </w:r>
+      <w:r>
+        <w:t xml:space="preserve"> angezeigt</w:t>
+      </w:r>
+    </w:p>
+    <w:p>
+      <w:pPr>
+        <w:pStyle w:val="Listenabsatz"/>
+        <w:numPr>
+          <w:ilvl w:val="0"/>
+          <w:numId w:val="22"/>
+        </w:numPr>
+      </w:pPr>
+      <w:r>
+        <w:t>Zu Beginn des Spiels ist das Spielfeld leer</w:t>
+      </w:r>
+    </w:p>
+    <w:p>
+      <w:pPr>
+        <w:pStyle w:val="Listenabsatz"/>
+        <w:numPr>
+          <w:ilvl w:val="0"/>
+          <w:numId w:val="22"/>
+        </w:numPr>
+      </w:pPr>
+      <w:r>
+        <w:t>Im Spielverlauf nimmt die Geschwindigkeit der Hindernisse zu</w:t>
+      </w:r>
+    </w:p>
+    <w:p>
+      <w:pPr>
+        <w:pStyle w:val="Listenabsatz"/>
+        <w:numPr>
+          <w:ilvl w:val="0"/>
+          <w:numId w:val="22"/>
+        </w:numPr>
+      </w:pPr>
+      <w:r>
+        <w:t xml:space="preserve">Im Spielverlauf nimmt die </w:t>
+      </w:r>
+      <w:proofErr w:type="spellStart"/>
+      <w:r>
+        <w:t>Hindernissdichte</w:t>
+      </w:r>
+      <w:proofErr w:type="spellEnd"/>
+      <w:r>
+        <w:t xml:space="preserve"> zu</w:t>
+      </w:r>
+    </w:p>
+    <w:p>
+      <w:pPr>
+        <w:pStyle w:val="Listenabsatz"/>
+        <w:numPr>
+          <w:ilvl w:val="0"/>
+          <w:numId w:val="22"/>
+        </w:numPr>
+      </w:pPr>
+      <w:r>
+        <w:t xml:space="preserve">Beim Spielende wird „Game Over“ angezeigt Nähere </w:t>
+      </w:r>
+      <w:r>
+        <w:t>Infos</w:t>
+      </w:r>
+      <w:r>
+        <w:t xml:space="preserve"> unter </w:t>
+      </w:r>
+      <w:r>
+        <w:t>Pause/End Menü</w:t>
+      </w:r>
+    </w:p>
+    <w:p>
+      <w:pPr>
+        <w:pStyle w:val="Listenabsatz"/>
+        <w:numPr>
+          <w:ilvl w:val="0"/>
+          <w:numId w:val="22"/>
+        </w:numPr>
+      </w:pPr>
+      <w:r>
         <w:t>Bei Spielbeginn befindet sich die Spielfigur in der mittleren Spalte</w:t>
       </w:r>
     </w:p>
@@ -3598,7 +3739,118 @@
         <w:t>Pause/ End Menü</w:t>
       </w:r>
     </w:p>
-    <w:p/>
+    <w:p>
+      <w:pPr>
+        <w:pStyle w:val="Listenabsatz"/>
+        <w:numPr>
+          <w:ilvl w:val="0"/>
+          <w:numId w:val="22"/>
+        </w:numPr>
+      </w:pPr>
+      <w:r>
+        <w:t xml:space="preserve">Dem Spieler soll zu jeder Zeit möglich sein das Spiel zu Pausieren </w:t>
+      </w:r>
+    </w:p>
+    <w:p>
+      <w:pPr>
+        <w:pStyle w:val="Listenabsatz"/>
+        <w:numPr>
+          <w:ilvl w:val="0"/>
+          <w:numId w:val="22"/>
+        </w:numPr>
+      </w:pPr>
+      <w:r>
+        <w:lastRenderedPageBreak/>
+        <w:t>Im Pause Menü soll er die Auswahl bekommen</w:t>
+      </w:r>
+    </w:p>
+    <w:p>
+      <w:pPr>
+        <w:pStyle w:val="Listenabsatz"/>
+        <w:numPr>
+          <w:ilvl w:val="0"/>
+          <w:numId w:val="22"/>
+        </w:numPr>
+      </w:pPr>
+      <w:r>
+        <w:t xml:space="preserve">Das Pause Menü soll den Punkt haben „Hauptmenü“ </w:t>
+      </w:r>
+    </w:p>
+    <w:p>
+      <w:pPr>
+        <w:pStyle w:val="Listenabsatz"/>
+        <w:numPr>
+          <w:ilvl w:val="0"/>
+          <w:numId w:val="22"/>
+        </w:numPr>
+      </w:pPr>
+      <w:r>
+        <w:t>Das Pause Menü soll den Punkt haben „Weiter Spielen“</w:t>
+      </w:r>
+      <w:r>
+        <w:t xml:space="preserve"> </w:t>
+      </w:r>
+    </w:p>
+    <w:p>
+      <w:pPr>
+        <w:pStyle w:val="Listenabsatz"/>
+        <w:numPr>
+          <w:ilvl w:val="0"/>
+          <w:numId w:val="22"/>
+        </w:numPr>
+      </w:pPr>
+      <w:r>
+        <w:t xml:space="preserve">Wenn der Spieler alle Leben verloren </w:t>
+      </w:r>
+      <w:r>
+        <w:t>hat,</w:t>
+      </w:r>
+      <w:r>
+        <w:t xml:space="preserve"> </w:t>
+      </w:r>
+      <w:r>
+        <w:t>geht es in den End Screen</w:t>
+      </w:r>
+    </w:p>
+    <w:p>
+      <w:pPr>
+        <w:pStyle w:val="Listenabsatz"/>
+        <w:numPr>
+          <w:ilvl w:val="0"/>
+          <w:numId w:val="22"/>
+        </w:numPr>
+      </w:pPr>
+      <w:r>
+        <w:t>Im End Screen soll es die Möglichkeit geben das Spiel zu Beenden</w:t>
+      </w:r>
+    </w:p>
+    <w:p>
+      <w:pPr>
+        <w:pStyle w:val="Listenabsatz"/>
+        <w:numPr>
+          <w:ilvl w:val="0"/>
+          <w:numId w:val="22"/>
+        </w:numPr>
+      </w:pPr>
+      <w:r>
+        <w:t xml:space="preserve">Im End Screen soll es die </w:t>
+      </w:r>
+      <w:r>
+        <w:t>Möglichkeit geben nochmal das Spiel zu starten</w:t>
+      </w:r>
+    </w:p>
+    <w:p>
+      <w:pPr>
+        <w:pStyle w:val="Listenabsatz"/>
+        <w:numPr>
+          <w:ilvl w:val="0"/>
+          <w:numId w:val="22"/>
+        </w:numPr>
+      </w:pPr>
+      <w:r>
+        <w:t>Im End Screen soll es die Möglichkeit geben zum Hauptmenü zurückzukehren</w:t>
+      </w:r>
+    </w:p>
     <w:p>
       <w:pPr>
         <w:pStyle w:val="berschrift2"/>
@@ -3677,7 +3929,7 @@
           <w:szCs w:val="24"/>
         </w:rPr>
         <w:sectPr>
-          <w:footerReference w:type="default" r:id="rId11"/>
+          <w:footerReference w:type="default" r:id="rId12"/>
           <w:pgSz w:w="11906" w:h="16838"/>
           <w:pgMar w:top="1418" w:right="1418" w:bottom="1418" w:left="1418" w:header="709" w:footer="709" w:gutter="0"/>
           <w:pgNumType w:start="1"/>
@@ -3890,94 +4142,9 @@
     <w:r>
       <w:rPr>
         <w:noProof/>
-        <w14:ligatures w14:val="standardContextual"/>
       </w:rPr>
       <w:drawing>
-        <wp:anchor distT="0" distB="0" distL="114300" distR="114300" simplePos="0" relativeHeight="251660288" behindDoc="0" locked="0" layoutInCell="1" allowOverlap="1" wp14:anchorId="0F880FAA" wp14:editId="557604F9">
-          <wp:simplePos x="0" y="0"/>
-          <wp:positionH relativeFrom="margin">
-            <wp:posOffset>4711700</wp:posOffset>
-          </wp:positionH>
-          <wp:positionV relativeFrom="paragraph">
-            <wp:posOffset>50326</wp:posOffset>
-          </wp:positionV>
-          <wp:extent cx="1042035" cy="395605"/>
-          <wp:effectExtent l="0" t="0" r="5715" b="4445"/>
-          <wp:wrapThrough wrapText="bothSides">
-            <wp:wrapPolygon edited="0">
-              <wp:start x="0" y="0"/>
-              <wp:lineTo x="0" y="20803"/>
-              <wp:lineTo x="15005" y="20803"/>
-              <wp:lineTo x="15005" y="16642"/>
-              <wp:lineTo x="21324" y="13522"/>
-              <wp:lineTo x="21324" y="0"/>
-              <wp:lineTo x="0" y="0"/>
-            </wp:wrapPolygon>
-          </wp:wrapThrough>
-          <wp:docPr id="1827680781" name="Grafik 1827680781" descr="Ein Bild, das Schrift, Grafiken, Grafikdesign, Screenshot enthält.&#10;&#10;Automatisch generierte Beschreibung">
-            <a:extLst xmlns:a="http://schemas.openxmlformats.org/drawingml/2006/main">
-              <a:ext uri="{FF2B5EF4-FFF2-40B4-BE49-F238E27FC236}">
-                <a16:creationId xmlns:a16="http://schemas.microsoft.com/office/drawing/2014/main" id="{E0A72641-FD1C-4DC0-BCA6-C74EE185A30A}"/>
-              </a:ext>
-            </a:extLst>
-          </wp:docPr>
-          <wp:cNvGraphicFramePr>
-            <a:graphicFrameLocks xmlns:a="http://schemas.openxmlformats.org/drawingml/2006/main" noChangeAspect="1"/>
-          </wp:cNvGraphicFramePr>
-          <a:graphic xmlns:a="http://schemas.openxmlformats.org/drawingml/2006/main">
-            <a:graphicData uri="http://schemas.openxmlformats.org/drawingml/2006/picture">
-              <pic:pic xmlns:pic="http://schemas.openxmlformats.org/drawingml/2006/picture">
-                <pic:nvPicPr>
-                  <pic:cNvPr id="5" name="Grafik 4" descr="Ein Bild, das Schrift, Grafiken, Grafikdesign, Screenshot enthält.&#10;&#10;Automatisch generierte Beschreibung">
-                    <a:extLst>
-                      <a:ext uri="{FF2B5EF4-FFF2-40B4-BE49-F238E27FC236}">
-                        <a16:creationId xmlns:a16="http://schemas.microsoft.com/office/drawing/2014/main" id="{E0A72641-FD1C-4DC0-BCA6-C74EE185A30A}"/>
-                      </a:ext>
-                    </a:extLst>
-                  </pic:cNvPr>
-                  <pic:cNvPicPr>
-                    <a:picLocks noChangeAspect="1"/>
-                  </pic:cNvPicPr>
-                </pic:nvPicPr>
-                <pic:blipFill>
-                  <a:blip r:embed="rId1" cstate="print">
-                    <a:extLst>
-                      <a:ext uri="{28A0092B-C50C-407E-A947-70E740481C1C}">
-                        <a14:useLocalDpi xmlns:a14="http://schemas.microsoft.com/office/drawing/2010/main" val="0"/>
-                      </a:ext>
-                    </a:extLst>
-                  </a:blip>
-                  <a:stretch>
-                    <a:fillRect/>
-                  </a:stretch>
-                </pic:blipFill>
-                <pic:spPr>
-                  <a:xfrm>
-                    <a:off x="0" y="0"/>
-                    <a:ext cx="1042035" cy="395605"/>
-                  </a:xfrm>
-                  <a:prstGeom prst="rect">
-                    <a:avLst/>
-                  </a:prstGeom>
-                </pic:spPr>
-              </pic:pic>
-            </a:graphicData>
-          </a:graphic>
-          <wp14:sizeRelH relativeFrom="page">
-            <wp14:pctWidth>0</wp14:pctWidth>
-          </wp14:sizeRelH>
-          <wp14:sizeRelV relativeFrom="page">
-            <wp14:pctHeight>0</wp14:pctHeight>
-          </wp14:sizeRelV>
-        </wp:anchor>
-      </w:drawing>
-    </w:r>
-    <w:r>
-      <w:rPr>
-        <w:noProof/>
-      </w:rPr>
-      <w:drawing>
-        <wp:inline distT="0" distB="0" distL="0" distR="0" wp14:anchorId="7BB8658B" wp14:editId="7D8F9609">
+        <wp:inline distT="0" distB="0" distL="0" distR="0" wp14:anchorId="7BB8658B" wp14:editId="65761EEC">
           <wp:extent cx="1229599" cy="539750"/>
           <wp:effectExtent l="0" t="0" r="8890" b="0"/>
           <wp:docPr id="1625901878" name="Grafik 1625901878"/>
@@ -3994,7 +4161,7 @@
                   </pic:cNvPicPr>
                 </pic:nvPicPr>
                 <pic:blipFill rotWithShape="1">
-                  <a:blip r:embed="rId2">
+                  <a:blip r:embed="rId1">
                     <a:extLst>
                       <a:ext uri="{28A0092B-C50C-407E-A947-70E740481C1C}">
                         <a14:useLocalDpi xmlns:a14="http://schemas.microsoft.com/office/drawing/2010/main" val="0"/>
@@ -4159,91 +4326,6 @@
                       <a14:shadowObscured xmlns:a14="http://schemas.microsoft.com/office/drawing/2010/main"/>
                     </a:ext>
                   </a:extLst>
-                </pic:spPr>
-              </pic:pic>
-            </a:graphicData>
-          </a:graphic>
-          <wp14:sizeRelH relativeFrom="page">
-            <wp14:pctWidth>0</wp14:pctWidth>
-          </wp14:sizeRelH>
-          <wp14:sizeRelV relativeFrom="page">
-            <wp14:pctHeight>0</wp14:pctHeight>
-          </wp14:sizeRelV>
-        </wp:anchor>
-      </w:drawing>
-    </w:r>
-    <w:r>
-      <w:rPr>
-        <w:noProof/>
-        <w14:ligatures w14:val="standardContextual"/>
-      </w:rPr>
-      <w:drawing>
-        <wp:anchor distT="0" distB="0" distL="114300" distR="114300" simplePos="0" relativeHeight="251658240" behindDoc="0" locked="0" layoutInCell="1" allowOverlap="1" wp14:anchorId="295D8ADF" wp14:editId="588B52BF">
-          <wp:simplePos x="0" y="0"/>
-          <wp:positionH relativeFrom="margin">
-            <wp:posOffset>4614116</wp:posOffset>
-          </wp:positionH>
-          <wp:positionV relativeFrom="paragraph">
-            <wp:posOffset>161925</wp:posOffset>
-          </wp:positionV>
-          <wp:extent cx="1572260" cy="596900"/>
-          <wp:effectExtent l="0" t="0" r="8890" b="0"/>
-          <wp:wrapThrough wrapText="bothSides">
-            <wp:wrapPolygon edited="0">
-              <wp:start x="0" y="0"/>
-              <wp:lineTo x="0" y="20681"/>
-              <wp:lineTo x="14656" y="20681"/>
-              <wp:lineTo x="21460" y="12409"/>
-              <wp:lineTo x="21460" y="8962"/>
-              <wp:lineTo x="21199" y="0"/>
-              <wp:lineTo x="0" y="0"/>
-            </wp:wrapPolygon>
-          </wp:wrapThrough>
-          <wp:docPr id="741137985" name="Grafik 741137985" descr="Ein Bild, das Schrift, Grafiken, Grafikdesign, Screenshot enthält.&#10;&#10;Automatisch generierte Beschreibung">
-            <a:extLst xmlns:a="http://schemas.openxmlformats.org/drawingml/2006/main">
-              <a:ext uri="{FF2B5EF4-FFF2-40B4-BE49-F238E27FC236}">
-                <a16:creationId xmlns:a16="http://schemas.microsoft.com/office/drawing/2014/main" id="{E0A72641-FD1C-4DC0-BCA6-C74EE185A30A}"/>
-              </a:ext>
-            </a:extLst>
-          </wp:docPr>
-          <wp:cNvGraphicFramePr>
-            <a:graphicFrameLocks xmlns:a="http://schemas.openxmlformats.org/drawingml/2006/main" noChangeAspect="1"/>
-          </wp:cNvGraphicFramePr>
-          <a:graphic xmlns:a="http://schemas.openxmlformats.org/drawingml/2006/main">
-            <a:graphicData uri="http://schemas.openxmlformats.org/drawingml/2006/picture">
-              <pic:pic xmlns:pic="http://schemas.openxmlformats.org/drawingml/2006/picture">
-                <pic:nvPicPr>
-                  <pic:cNvPr id="5" name="Grafik 4" descr="Ein Bild, das Schrift, Grafiken, Grafikdesign, Screenshot enthält.&#10;&#10;Automatisch generierte Beschreibung">
-                    <a:extLst>
-                      <a:ext uri="{FF2B5EF4-FFF2-40B4-BE49-F238E27FC236}">
-                        <a16:creationId xmlns:a16="http://schemas.microsoft.com/office/drawing/2014/main" id="{E0A72641-FD1C-4DC0-BCA6-C74EE185A30A}"/>
-                      </a:ext>
-                    </a:extLst>
-                  </pic:cNvPr>
-                  <pic:cNvPicPr>
-                    <a:picLocks noChangeAspect="1"/>
-                  </pic:cNvPicPr>
-                </pic:nvPicPr>
-                <pic:blipFill>
-                  <a:blip r:embed="rId2" cstate="print">
-                    <a:extLst>
-                      <a:ext uri="{28A0092B-C50C-407E-A947-70E740481C1C}">
-                        <a14:useLocalDpi xmlns:a14="http://schemas.microsoft.com/office/drawing/2010/main" val="0"/>
-                      </a:ext>
-                    </a:extLst>
-                  </a:blip>
-                  <a:stretch>
-                    <a:fillRect/>
-                  </a:stretch>
-                </pic:blipFill>
-                <pic:spPr>
-                  <a:xfrm>
-                    <a:off x="0" y="0"/>
-                    <a:ext cx="1572260" cy="596900"/>
-                  </a:xfrm>
-                  <a:prstGeom prst="rect">
-                    <a:avLst/>
-                  </a:prstGeom>
                 </pic:spPr>
               </pic:pic>
             </a:graphicData>

</xml_diff>